<commit_message>
gotta test the moth trailer
</commit_message>
<xml_diff>
--- a/docs/MothTextReference.docx
+++ b/docs/MothTextReference.docx
@@ -20,7 +20,7 @@
           <w:sz w:val="22"/>
           <w:szCs w:val="22"/>
         </w:rPr>
-        <w:t>General Overview of what this project did for me</w:t>
+        <w:t>General Overview</w:t>
       </w:r>
       <w:r>
         <w:rPr>
@@ -47,65 +47,469 @@
           <w:sz w:val="22"/>
           <w:szCs w:val="22"/>
         </w:rPr>
-        <w:t xml:space="preserve">This project gave me a great opportunity to experience the </w:t>
-      </w:r>
-      <w:r>
-        <w:rPr>
-          <w:rFonts w:ascii="Times New Roman" w:hAnsi="Times New Roman" w:cs="Times New Roman"/>
-          <w:sz w:val="22"/>
-          <w:szCs w:val="22"/>
-        </w:rPr>
-        <w:t>workflow</w:t>
-      </w:r>
-      <w:r>
-        <w:rPr>
-          <w:rFonts w:ascii="Times New Roman" w:hAnsi="Times New Roman" w:cs="Times New Roman"/>
-          <w:sz w:val="22"/>
-          <w:szCs w:val="22"/>
-        </w:rPr>
-        <w:t xml:space="preserve"> involved with other people striving for the same goal in a large </w:t>
-      </w:r>
-      <w:r>
-        <w:rPr>
-          <w:rFonts w:ascii="Times New Roman" w:hAnsi="Times New Roman" w:cs="Times New Roman"/>
-          <w:sz w:val="22"/>
-          <w:szCs w:val="22"/>
-        </w:rPr>
-        <w:t>2</w:t>
-      </w:r>
-      <w:r>
-        <w:rPr>
-          <w:rFonts w:ascii="Times New Roman" w:hAnsi="Times New Roman" w:cs="Times New Roman"/>
-          <w:sz w:val="22"/>
-          <w:szCs w:val="22"/>
-        </w:rPr>
-        <w:t>2</w:t>
-      </w:r>
-      <w:r>
-        <w:rPr>
-          <w:rFonts w:ascii="Times New Roman" w:hAnsi="Times New Roman" w:cs="Times New Roman"/>
-          <w:sz w:val="22"/>
-          <w:szCs w:val="22"/>
-        </w:rPr>
-        <w:t>-person</w:t>
-      </w:r>
-      <w:r>
-        <w:rPr>
-          <w:rFonts w:ascii="Times New Roman" w:hAnsi="Times New Roman" w:cs="Times New Roman"/>
-          <w:sz w:val="22"/>
-          <w:szCs w:val="22"/>
-        </w:rPr>
-        <w:t xml:space="preserve"> project. I was give</w:t>
-      </w:r>
-      <w:r>
-        <w:rPr>
-          <w:rFonts w:ascii="Times New Roman" w:hAnsi="Times New Roman" w:cs="Times New Roman"/>
-          <w:sz w:val="22"/>
-          <w:szCs w:val="22"/>
-        </w:rPr>
-        <w:t xml:space="preserve">n the chance to take a leadership role of </w:t>
-      </w:r>
-      <w:r>
+        <w:t>To give the project a very basic overview: It was a 2</w:t>
+      </w:r>
+      <w:r>
+        <w:rPr>
+          <w:rFonts w:ascii="Times New Roman" w:hAnsi="Times New Roman" w:cs="Times New Roman"/>
+          <w:sz w:val="22"/>
+          <w:szCs w:val="22"/>
+        </w:rPr>
+        <w:t>2-person</w:t>
+      </w:r>
+      <w:r>
+        <w:rPr>
+          <w:rFonts w:ascii="Times New Roman" w:hAnsi="Times New Roman" w:cs="Times New Roman"/>
+          <w:sz w:val="22"/>
+          <w:szCs w:val="22"/>
+        </w:rPr>
+        <w:t xml:space="preserve"> student project </w:t>
+      </w:r>
+      <w:r>
+        <w:rPr>
+          <w:rFonts w:ascii="Times New Roman" w:hAnsi="Times New Roman" w:cs="Times New Roman"/>
+          <w:sz w:val="22"/>
+          <w:szCs w:val="22"/>
+        </w:rPr>
+        <w:t xml:space="preserve">using Unreal Engine 5 </w:t>
+      </w:r>
+      <w:r>
+        <w:rPr>
+          <w:rFonts w:ascii="Times New Roman" w:hAnsi="Times New Roman" w:cs="Times New Roman"/>
+          <w:sz w:val="22"/>
+          <w:szCs w:val="22"/>
+        </w:rPr>
+        <w:t>which was the largest team I had ever worked with</w:t>
+      </w:r>
+      <w:r>
+        <w:rPr>
+          <w:rFonts w:ascii="Times New Roman" w:hAnsi="Times New Roman" w:cs="Times New Roman"/>
+          <w:sz w:val="22"/>
+          <w:szCs w:val="22"/>
+        </w:rPr>
+        <w:t>.</w:t>
+      </w:r>
+      <w:r>
+        <w:rPr>
+          <w:rFonts w:ascii="Times New Roman" w:hAnsi="Times New Roman" w:cs="Times New Roman"/>
+          <w:sz w:val="22"/>
+          <w:szCs w:val="22"/>
+        </w:rPr>
+        <w:t xml:space="preserve"> </w:t>
+      </w:r>
+      <w:r>
+        <w:rPr>
+          <w:rFonts w:ascii="Times New Roman" w:hAnsi="Times New Roman" w:cs="Times New Roman"/>
+          <w:sz w:val="22"/>
+          <w:szCs w:val="22"/>
+        </w:rPr>
+        <w:t>It was t</w:t>
+      </w:r>
+      <w:r>
+        <w:rPr>
+          <w:rFonts w:ascii="Times New Roman" w:hAnsi="Times New Roman" w:cs="Times New Roman"/>
+          <w:sz w:val="22"/>
+          <w:szCs w:val="22"/>
+        </w:rPr>
+        <w:t xml:space="preserve">he first opportunity I had to work with all disciplines studying at the school. </w:t>
+      </w:r>
+      <w:r>
+        <w:rPr>
+          <w:rFonts w:ascii="Times New Roman" w:hAnsi="Times New Roman" w:cs="Times New Roman"/>
+          <w:sz w:val="22"/>
+          <w:szCs w:val="22"/>
+        </w:rPr>
+        <w:t xml:space="preserve">Our </w:t>
+      </w:r>
+      <w:r>
+        <w:rPr>
+          <w:rFonts w:ascii="Times New Roman" w:hAnsi="Times New Roman" w:cs="Times New Roman"/>
+          <w:sz w:val="22"/>
+          <w:szCs w:val="22"/>
+        </w:rPr>
+        <w:t>version control was</w:t>
+      </w:r>
+      <w:r>
+        <w:rPr>
+          <w:rFonts w:ascii="Times New Roman" w:hAnsi="Times New Roman" w:cs="Times New Roman"/>
+          <w:sz w:val="22"/>
+          <w:szCs w:val="22"/>
+        </w:rPr>
+        <w:t xml:space="preserve"> a Perforce repository set up by our </w:t>
+      </w:r>
+      <w:r>
+        <w:rPr>
+          <w:rFonts w:ascii="Times New Roman" w:hAnsi="Times New Roman" w:cs="Times New Roman"/>
+          <w:sz w:val="22"/>
+          <w:szCs w:val="22"/>
+        </w:rPr>
+        <w:t>school’s</w:t>
+      </w:r>
+      <w:r>
+        <w:rPr>
+          <w:rFonts w:ascii="Times New Roman" w:hAnsi="Times New Roman" w:cs="Times New Roman"/>
+          <w:sz w:val="22"/>
+          <w:szCs w:val="22"/>
+        </w:rPr>
+        <w:t xml:space="preserve"> IT </w:t>
+      </w:r>
+      <w:r>
+        <w:rPr>
+          <w:rFonts w:ascii="Times New Roman" w:hAnsi="Times New Roman" w:cs="Times New Roman"/>
+          <w:sz w:val="22"/>
+          <w:szCs w:val="22"/>
+        </w:rPr>
+        <w:t>department.</w:t>
+      </w:r>
+      <w:r>
+        <w:rPr>
+          <w:rFonts w:ascii="Times New Roman" w:hAnsi="Times New Roman" w:cs="Times New Roman"/>
+          <w:sz w:val="22"/>
+          <w:szCs w:val="22"/>
+        </w:rPr>
+        <w:t xml:space="preserve"> </w:t>
+      </w:r>
+      <w:r>
+        <w:rPr>
+          <w:rFonts w:ascii="Times New Roman" w:hAnsi="Times New Roman" w:cs="Times New Roman"/>
+          <w:sz w:val="22"/>
+          <w:szCs w:val="22"/>
+        </w:rPr>
+        <w:t>My main roles on the team were Quality Advocate and gameplay programmer.</w:t>
+      </w:r>
+    </w:p>
+    <w:p>
+      <w:pPr>
+        <w:rPr>
+          <w:rFonts w:ascii="Times New Roman" w:hAnsi="Times New Roman" w:cs="Times New Roman"/>
+          <w:sz w:val="22"/>
+          <w:szCs w:val="22"/>
+        </w:rPr>
+      </w:pPr>
+      <w:r>
+        <w:rPr>
+          <w:rFonts w:ascii="Times New Roman" w:hAnsi="Times New Roman" w:cs="Times New Roman"/>
+          <w:sz w:val="22"/>
+          <w:szCs w:val="22"/>
+        </w:rPr>
+        <w:t xml:space="preserve">So, what </w:t>
+      </w:r>
+      <w:r>
+        <w:rPr>
+          <w:rFonts w:ascii="Times New Roman" w:hAnsi="Times New Roman" w:cs="Times New Roman"/>
+          <w:sz w:val="22"/>
+          <w:szCs w:val="22"/>
+        </w:rPr>
+        <w:t xml:space="preserve">exactly </w:t>
+      </w:r>
+      <w:r>
+        <w:rPr>
+          <w:rFonts w:ascii="Times New Roman" w:hAnsi="Times New Roman" w:cs="Times New Roman"/>
+          <w:sz w:val="22"/>
+          <w:szCs w:val="22"/>
+        </w:rPr>
+        <w:t>did I do</w:t>
+      </w:r>
+      <w:r>
+        <w:rPr>
+          <w:rFonts w:ascii="Times New Roman" w:hAnsi="Times New Roman" w:cs="Times New Roman"/>
+          <w:sz w:val="22"/>
+          <w:szCs w:val="22"/>
+        </w:rPr>
+        <w:t xml:space="preserve"> working on the team</w:t>
+      </w:r>
+      <w:r>
+        <w:rPr>
+          <w:rFonts w:ascii="Times New Roman" w:hAnsi="Times New Roman" w:cs="Times New Roman"/>
+          <w:sz w:val="22"/>
+          <w:szCs w:val="22"/>
+        </w:rPr>
+        <w:t xml:space="preserve">? I learned more about responsibility in a leadership position and how to communicate with a team more effectively. </w:t>
+      </w:r>
+      <w:r>
+        <w:rPr>
+          <w:rFonts w:ascii="Times New Roman" w:hAnsi="Times New Roman" w:cs="Times New Roman"/>
+          <w:sz w:val="22"/>
+          <w:szCs w:val="22"/>
+          <w:highlight w:val="yellow"/>
+        </w:rPr>
+        <w:t>Communication between us became very spotty in the end and we had to work through that, but the game still ended in a much better place than I anticipated honestly.</w:t>
+      </w:r>
+      <w:r>
+        <w:rPr>
+          <w:rFonts w:ascii="Times New Roman" w:hAnsi="Times New Roman" w:cs="Times New Roman"/>
+          <w:sz w:val="22"/>
+          <w:szCs w:val="22"/>
+        </w:rPr>
+        <w:t xml:space="preserve"> My responsibilities as the Quality Advocate were processing weekly unit tests and maintaining a weekly playable build for our instructors. </w:t>
+      </w:r>
+      <w:r>
+        <w:rPr>
+          <w:rFonts w:ascii="Times New Roman" w:hAnsi="Times New Roman" w:cs="Times New Roman"/>
+          <w:sz w:val="22"/>
+          <w:szCs w:val="22"/>
+        </w:rPr>
+        <w:t xml:space="preserve">I enjoyed it. It was a different form of work I </w:t>
+      </w:r>
+      <w:r>
+        <w:rPr>
+          <w:rFonts w:ascii="Times New Roman" w:hAnsi="Times New Roman" w:cs="Times New Roman"/>
+          <w:sz w:val="22"/>
+          <w:szCs w:val="22"/>
+        </w:rPr>
+        <w:t>wasn’t</w:t>
+      </w:r>
+      <w:r>
+        <w:rPr>
+          <w:rFonts w:ascii="Times New Roman" w:hAnsi="Times New Roman" w:cs="Times New Roman"/>
+          <w:sz w:val="22"/>
+          <w:szCs w:val="22"/>
+        </w:rPr>
+        <w:t xml:space="preserve"> used </w:t>
+      </w:r>
+      <w:r>
+        <w:rPr>
+          <w:rFonts w:ascii="Times New Roman" w:hAnsi="Times New Roman" w:cs="Times New Roman"/>
+          <w:sz w:val="22"/>
+          <w:szCs w:val="22"/>
+        </w:rPr>
+        <w:t>to,</w:t>
+      </w:r>
+      <w:r>
+        <w:rPr>
+          <w:rFonts w:ascii="Times New Roman" w:hAnsi="Times New Roman" w:cs="Times New Roman"/>
+          <w:sz w:val="22"/>
+          <w:szCs w:val="22"/>
+        </w:rPr>
+        <w:t xml:space="preserve"> but it let me work with each member of my team and see ways for us to improve our game together</w:t>
+      </w:r>
+      <w:r>
+        <w:rPr>
+          <w:rFonts w:ascii="Times New Roman" w:hAnsi="Times New Roman" w:cs="Times New Roman"/>
+          <w:sz w:val="22"/>
+          <w:szCs w:val="22"/>
+        </w:rPr>
+        <w:t>.</w:t>
+      </w:r>
+      <w:r>
+        <w:rPr>
+          <w:rFonts w:ascii="Times New Roman" w:hAnsi="Times New Roman" w:cs="Times New Roman"/>
+          <w:sz w:val="22"/>
+          <w:szCs w:val="22"/>
+        </w:rPr>
+        <w:t xml:space="preserve"> </w:t>
+      </w:r>
+      <w:r>
+        <w:rPr>
+          <w:rFonts w:ascii="Times New Roman" w:hAnsi="Times New Roman" w:cs="Times New Roman"/>
+          <w:sz w:val="22"/>
+          <w:szCs w:val="22"/>
+        </w:rPr>
+        <w:t xml:space="preserve">Together </w:t>
+      </w:r>
+      <w:r>
+        <w:rPr>
+          <w:rFonts w:ascii="Times New Roman" w:hAnsi="Times New Roman" w:cs="Times New Roman"/>
+          <w:sz w:val="22"/>
+          <w:szCs w:val="22"/>
+        </w:rPr>
+        <w:t xml:space="preserve">some of my teammates </w:t>
+      </w:r>
+      <w:r>
+        <w:rPr>
+          <w:rFonts w:ascii="Times New Roman" w:hAnsi="Times New Roman" w:cs="Times New Roman"/>
+          <w:sz w:val="22"/>
+          <w:szCs w:val="22"/>
+        </w:rPr>
+        <w:t xml:space="preserve">and I would </w:t>
+      </w:r>
+      <w:r>
+        <w:rPr>
+          <w:rFonts w:ascii="Times New Roman" w:hAnsi="Times New Roman" w:cs="Times New Roman"/>
+          <w:sz w:val="22"/>
+          <w:szCs w:val="22"/>
+        </w:rPr>
+        <w:t>find</w:t>
+      </w:r>
+      <w:r>
+        <w:rPr>
+          <w:rFonts w:ascii="Times New Roman" w:hAnsi="Times New Roman" w:cs="Times New Roman"/>
+          <w:sz w:val="22"/>
+          <w:szCs w:val="22"/>
+        </w:rPr>
+        <w:t xml:space="preserve"> things </w:t>
+      </w:r>
+      <w:r>
+        <w:rPr>
+          <w:rFonts w:ascii="Times New Roman" w:hAnsi="Times New Roman" w:cs="Times New Roman"/>
+          <w:sz w:val="22"/>
+          <w:szCs w:val="22"/>
+        </w:rPr>
+        <w:t xml:space="preserve">that </w:t>
+      </w:r>
+      <w:r>
+        <w:rPr>
+          <w:rFonts w:ascii="Times New Roman" w:hAnsi="Times New Roman" w:cs="Times New Roman"/>
+          <w:sz w:val="22"/>
+          <w:szCs w:val="22"/>
+        </w:rPr>
+        <w:t>were breaking or just didn</w:t>
+      </w:r>
+      <w:r>
+        <w:rPr>
+          <w:rFonts w:ascii="Times New Roman" w:hAnsi="Times New Roman" w:cs="Times New Roman"/>
+          <w:sz w:val="22"/>
+          <w:szCs w:val="22"/>
+        </w:rPr>
+        <w:t>’t feel right in terms of quality</w:t>
+      </w:r>
+      <w:r>
+        <w:rPr>
+          <w:rFonts w:ascii="Times New Roman" w:hAnsi="Times New Roman" w:cs="Times New Roman"/>
+          <w:sz w:val="22"/>
+          <w:szCs w:val="22"/>
+        </w:rPr>
+        <w:t xml:space="preserve"> and experience</w:t>
+      </w:r>
+      <w:r>
+        <w:rPr>
+          <w:rFonts w:ascii="Times New Roman" w:hAnsi="Times New Roman" w:cs="Times New Roman"/>
+          <w:sz w:val="22"/>
+          <w:szCs w:val="22"/>
+        </w:rPr>
+        <w:t xml:space="preserve"> for the game</w:t>
+      </w:r>
+      <w:r>
+        <w:rPr>
+          <w:rFonts w:ascii="Times New Roman" w:hAnsi="Times New Roman" w:cs="Times New Roman"/>
+          <w:sz w:val="22"/>
+          <w:szCs w:val="22"/>
+        </w:rPr>
+        <w:t xml:space="preserve">. </w:t>
+      </w:r>
+      <w:r>
+        <w:rPr>
+          <w:rFonts w:ascii="Times New Roman" w:hAnsi="Times New Roman" w:cs="Times New Roman"/>
+          <w:sz w:val="22"/>
+          <w:szCs w:val="22"/>
+        </w:rPr>
+        <w:t>Even though I had this role I was still contributing to the game through gameplay impl</w:t>
+      </w:r>
+      <w:r>
+        <w:rPr>
+          <w:rFonts w:ascii="Times New Roman" w:hAnsi="Times New Roman" w:cs="Times New Roman"/>
+          <w:sz w:val="22"/>
+          <w:szCs w:val="22"/>
+        </w:rPr>
+        <w:t>eme</w:t>
+      </w:r>
+      <w:r>
+        <w:rPr>
+          <w:rFonts w:ascii="Times New Roman" w:hAnsi="Times New Roman" w:cs="Times New Roman"/>
+          <w:sz w:val="22"/>
+          <w:szCs w:val="22"/>
+        </w:rPr>
+        <w:t>ntation.</w:t>
+      </w:r>
+      <w:r>
+        <w:rPr>
+          <w:rFonts w:ascii="Times New Roman" w:hAnsi="Times New Roman" w:cs="Times New Roman"/>
+          <w:sz w:val="22"/>
+          <w:szCs w:val="22"/>
+        </w:rPr>
+        <w:t xml:space="preserve"> </w:t>
+      </w:r>
+      <w:r>
+        <w:rPr>
+          <w:rFonts w:ascii="Times New Roman" w:hAnsi="Times New Roman" w:cs="Times New Roman"/>
+          <w:sz w:val="22"/>
+          <w:szCs w:val="22"/>
+        </w:rPr>
+        <w:t xml:space="preserve">Key features </w:t>
+      </w:r>
+      <w:r>
+        <w:rPr>
+          <w:rFonts w:ascii="Times New Roman" w:hAnsi="Times New Roman" w:cs="Times New Roman"/>
+          <w:sz w:val="22"/>
+          <w:szCs w:val="22"/>
+        </w:rPr>
+        <w:t xml:space="preserve">I was responsible for setting up the experience for </w:t>
+      </w:r>
+      <w:r>
+        <w:rPr>
+          <w:rFonts w:ascii="Times New Roman" w:hAnsi="Times New Roman" w:cs="Times New Roman"/>
+          <w:sz w:val="22"/>
+          <w:szCs w:val="22"/>
+        </w:rPr>
+        <w:t xml:space="preserve">were </w:t>
+      </w:r>
+      <w:r>
+        <w:rPr>
+          <w:rFonts w:ascii="Times New Roman" w:hAnsi="Times New Roman" w:cs="Times New Roman"/>
+          <w:sz w:val="22"/>
+          <w:szCs w:val="22"/>
+        </w:rPr>
+        <w:t xml:space="preserve">the </w:t>
+      </w:r>
+      <w:r>
+        <w:rPr>
+          <w:rFonts w:ascii="Times New Roman" w:hAnsi="Times New Roman" w:cs="Times New Roman"/>
+          <w:sz w:val="22"/>
+          <w:szCs w:val="22"/>
+        </w:rPr>
+        <w:t xml:space="preserve">Companion Moths, Breeding Tank, and MOTHer 3000 or </w:t>
+      </w:r>
+      <w:r>
+        <w:rPr>
+          <w:rFonts w:ascii="Times New Roman" w:hAnsi="Times New Roman" w:cs="Times New Roman"/>
+          <w:sz w:val="22"/>
+          <w:szCs w:val="22"/>
+        </w:rPr>
+        <w:t>M</w:t>
+      </w:r>
+      <w:r>
+        <w:rPr>
+          <w:rFonts w:ascii="Times New Roman" w:hAnsi="Times New Roman" w:cs="Times New Roman"/>
+          <w:sz w:val="22"/>
+          <w:szCs w:val="22"/>
+        </w:rPr>
+        <w:t xml:space="preserve">oth </w:t>
+      </w:r>
+      <w:r>
+        <w:rPr>
+          <w:rFonts w:ascii="Times New Roman" w:hAnsi="Times New Roman" w:cs="Times New Roman"/>
+          <w:sz w:val="22"/>
+          <w:szCs w:val="22"/>
+        </w:rPr>
+        <w:t>F</w:t>
+      </w:r>
+      <w:r>
+        <w:rPr>
+          <w:rFonts w:ascii="Times New Roman" w:hAnsi="Times New Roman" w:cs="Times New Roman"/>
+          <w:sz w:val="22"/>
+          <w:szCs w:val="22"/>
+        </w:rPr>
+        <w:t>rame as I usually called it since that’s just easier to understand.</w:t>
+      </w:r>
+      <w:r>
+        <w:rPr>
+          <w:rFonts w:ascii="Times New Roman" w:hAnsi="Times New Roman" w:cs="Times New Roman"/>
+          <w:sz w:val="22"/>
+          <w:szCs w:val="22"/>
+        </w:rPr>
+        <w:t xml:space="preserve"> Smaller roles were being a generalized bug fixer and getting unreal to </w:t>
+      </w:r>
+      <w:r>
+        <w:rPr>
+          <w:rFonts w:ascii="Times New Roman" w:hAnsi="Times New Roman" w:cs="Times New Roman"/>
+          <w:sz w:val="22"/>
+          <w:szCs w:val="22"/>
+        </w:rPr>
+        <w:t xml:space="preserve"> </w:t>
+      </w:r>
+    </w:p>
+    <w:p>
+      <w:pPr>
         <w:rPr>
           <w:rFonts w:ascii="Times New Roman" w:hAnsi="Times New Roman" w:cs="Times New Roman"/>
           <w:b/>
@@ -113,24 +517,7 @@
           <w:sz w:val="22"/>
           <w:szCs w:val="22"/>
         </w:rPr>
-        <w:t>quality advocate</w:t>
-      </w:r>
-      <w:r>
-        <w:rPr>
-          <w:rFonts w:ascii="Times New Roman" w:hAnsi="Times New Roman" w:cs="Times New Roman"/>
-          <w:sz w:val="22"/>
-          <w:szCs w:val="22"/>
-        </w:rPr>
-        <w:t xml:space="preserve"> on the team and learned what it meant to be responsible for a large aspect of the game – especially so, since it involved all disciplines on our team. With previous experience as a tech lead for a much smaller project, I had an idea of what would be similar but that under shadowed what I was truly meant to do as I struggled with being truly effective. This was one of the most prominent roles I had on the team but what I </w:t>
-      </w:r>
-      <w:r>
-        <w:rPr>
-          <w:rFonts w:ascii="Times New Roman" w:hAnsi="Times New Roman" w:cs="Times New Roman"/>
-          <w:sz w:val="22"/>
-          <w:szCs w:val="22"/>
-        </w:rPr>
-        <w:t xml:space="preserve">genuinely love and was able to learn more about it in unreal was more </w:t>
-      </w:r>
+      </w:pPr>
       <w:r>
         <w:rPr>
           <w:rFonts w:ascii="Times New Roman" w:hAnsi="Times New Roman" w:cs="Times New Roman"/>
@@ -139,6 +526,1526 @@
           <w:sz w:val="22"/>
           <w:szCs w:val="22"/>
         </w:rPr>
+        <w:t>Quality Advocate</w:t>
+      </w:r>
+    </w:p>
+    <w:p>
+      <w:pPr>
+        <w:rPr>
+          <w:rFonts w:ascii="Times New Roman" w:hAnsi="Times New Roman" w:cs="Times New Roman"/>
+          <w:sz w:val="22"/>
+          <w:szCs w:val="22"/>
+        </w:rPr>
+      </w:pPr>
+      <w:r>
+        <w:rPr>
+          <w:rFonts w:ascii="Times New Roman" w:hAnsi="Times New Roman" w:cs="Times New Roman"/>
+          <w:sz w:val="22"/>
+          <w:szCs w:val="22"/>
+        </w:rPr>
+        <w:t xml:space="preserve">Each leadership role during this project had a mentor to reach out to for questions and </w:t>
+      </w:r>
+      <w:r>
+        <w:rPr>
+          <w:rFonts w:ascii="Times New Roman" w:hAnsi="Times New Roman" w:cs="Times New Roman"/>
+          <w:sz w:val="22"/>
+          <w:szCs w:val="22"/>
+        </w:rPr>
+        <w:t>they</w:t>
+      </w:r>
+      <w:r>
+        <w:rPr>
+          <w:rFonts w:ascii="Times New Roman" w:hAnsi="Times New Roman" w:cs="Times New Roman"/>
+          <w:sz w:val="22"/>
+          <w:szCs w:val="22"/>
+        </w:rPr>
+        <w:t xml:space="preserve"> gave a </w:t>
+      </w:r>
+      <w:r>
+        <w:rPr>
+          <w:rFonts w:ascii="Times New Roman" w:hAnsi="Times New Roman" w:cs="Times New Roman"/>
+          <w:sz w:val="22"/>
+          <w:szCs w:val="22"/>
+        </w:rPr>
+        <w:t xml:space="preserve">helping hand to get </w:t>
+      </w:r>
+      <w:r>
+        <w:rPr>
+          <w:rFonts w:ascii="Times New Roman" w:hAnsi="Times New Roman" w:cs="Times New Roman"/>
+          <w:sz w:val="22"/>
+          <w:szCs w:val="22"/>
+        </w:rPr>
+        <w:t>us started</w:t>
+      </w:r>
+      <w:r>
+        <w:rPr>
+          <w:rFonts w:ascii="Times New Roman" w:hAnsi="Times New Roman" w:cs="Times New Roman"/>
+          <w:sz w:val="22"/>
+          <w:szCs w:val="22"/>
+        </w:rPr>
+        <w:t xml:space="preserve">. </w:t>
+      </w:r>
+      <w:r>
+        <w:rPr>
+          <w:rFonts w:ascii="Times New Roman" w:hAnsi="Times New Roman" w:cs="Times New Roman"/>
+          <w:sz w:val="22"/>
+          <w:szCs w:val="22"/>
+        </w:rPr>
+        <w:t>Our QA (Quality Advocate) mentor</w:t>
+      </w:r>
+      <w:r>
+        <w:rPr>
+          <w:rFonts w:ascii="Times New Roman" w:hAnsi="Times New Roman" w:cs="Times New Roman"/>
+          <w:sz w:val="22"/>
+          <w:szCs w:val="22"/>
+        </w:rPr>
+        <w:t xml:space="preserve"> provided an example and general idea on what to include for our weekly unit tests to make sure everything worked as intended with a r</w:t>
+      </w:r>
+      <w:r>
+        <w:rPr>
+          <w:rFonts w:ascii="Times New Roman" w:hAnsi="Times New Roman" w:cs="Times New Roman"/>
+          <w:sz w:val="22"/>
+          <w:szCs w:val="22"/>
+        </w:rPr>
+        <w:t>ating</w:t>
+      </w:r>
+      <w:r>
+        <w:rPr>
+          <w:rFonts w:ascii="Times New Roman" w:hAnsi="Times New Roman" w:cs="Times New Roman"/>
+          <w:sz w:val="22"/>
+          <w:szCs w:val="22"/>
+        </w:rPr>
+        <w:t>: Failed, Partial, Passed</w:t>
+      </w:r>
+      <w:r>
+        <w:rPr>
+          <w:rFonts w:ascii="Times New Roman" w:hAnsi="Times New Roman" w:cs="Times New Roman"/>
+          <w:sz w:val="22"/>
+          <w:szCs w:val="22"/>
+        </w:rPr>
+        <w:t>.</w:t>
+      </w:r>
+      <w:r>
+        <w:rPr>
+          <w:rFonts w:ascii="Times New Roman" w:hAnsi="Times New Roman" w:cs="Times New Roman"/>
+          <w:sz w:val="22"/>
+          <w:szCs w:val="22"/>
+        </w:rPr>
+        <w:t xml:space="preserve"> </w:t>
+      </w:r>
+      <w:r>
+        <w:rPr>
+          <w:rFonts w:ascii="Times New Roman" w:hAnsi="Times New Roman" w:cs="Times New Roman"/>
+          <w:sz w:val="22"/>
+          <w:szCs w:val="22"/>
+        </w:rPr>
+        <w:t xml:space="preserve">The way to use the spreadsheet was </w:t>
+      </w:r>
+      <w:r>
+        <w:rPr>
+          <w:rFonts w:ascii="Times New Roman" w:hAnsi="Times New Roman" w:cs="Times New Roman"/>
+          <w:sz w:val="22"/>
+          <w:szCs w:val="22"/>
+        </w:rPr>
+        <w:t>easy</w:t>
+      </w:r>
+      <w:r>
+        <w:rPr>
+          <w:rFonts w:ascii="Times New Roman" w:hAnsi="Times New Roman" w:cs="Times New Roman"/>
+          <w:sz w:val="22"/>
+          <w:szCs w:val="22"/>
+        </w:rPr>
+        <w:t xml:space="preserve"> </w:t>
+      </w:r>
+      <w:r>
+        <w:rPr>
+          <w:rFonts w:ascii="Times New Roman" w:hAnsi="Times New Roman" w:cs="Times New Roman"/>
+          <w:sz w:val="22"/>
+          <w:szCs w:val="22"/>
+        </w:rPr>
+        <w:t>since</w:t>
+      </w:r>
+      <w:r>
+        <w:rPr>
+          <w:rFonts w:ascii="Times New Roman" w:hAnsi="Times New Roman" w:cs="Times New Roman"/>
+          <w:sz w:val="22"/>
+          <w:szCs w:val="22"/>
+        </w:rPr>
+        <w:t xml:space="preserve"> it was just a checklist. The way I would fill it out was just by playing through the game </w:t>
+      </w:r>
+      <w:r>
+        <w:rPr>
+          <w:rFonts w:ascii="Times New Roman" w:hAnsi="Times New Roman" w:cs="Times New Roman"/>
+          <w:sz w:val="22"/>
+          <w:szCs w:val="22"/>
+        </w:rPr>
+        <w:t xml:space="preserve">thinking like a player at first and then trying to see how fast I could break new features. I would also </w:t>
+      </w:r>
+      <w:r>
+        <w:rPr>
+          <w:rFonts w:ascii="Times New Roman" w:hAnsi="Times New Roman" w:cs="Times New Roman"/>
+          <w:sz w:val="22"/>
+          <w:szCs w:val="22"/>
+        </w:rPr>
+        <w:t>fill out our weekly build notes</w:t>
+      </w:r>
+      <w:r>
+        <w:rPr>
+          <w:rFonts w:ascii="Times New Roman" w:hAnsi="Times New Roman" w:cs="Times New Roman"/>
+          <w:sz w:val="22"/>
+          <w:szCs w:val="22"/>
+        </w:rPr>
+        <w:t xml:space="preserve"> in tandem with the sheet to log any outstanding features for our project leads</w:t>
+      </w:r>
+      <w:r>
+        <w:rPr>
+          <w:rFonts w:ascii="Times New Roman" w:hAnsi="Times New Roman" w:cs="Times New Roman"/>
+          <w:sz w:val="22"/>
+          <w:szCs w:val="22"/>
+        </w:rPr>
+        <w:t>/directors</w:t>
+      </w:r>
+      <w:r>
+        <w:rPr>
+          <w:rFonts w:ascii="Times New Roman" w:hAnsi="Times New Roman" w:cs="Times New Roman"/>
+          <w:sz w:val="22"/>
+          <w:szCs w:val="22"/>
+        </w:rPr>
+        <w:t>.</w:t>
+      </w:r>
+    </w:p>
+    <w:p>
+      <w:pPr>
+        <w:rPr>
+          <w:rFonts w:ascii="Times New Roman" w:hAnsi="Times New Roman" w:cs="Times New Roman"/>
+          <w:sz w:val="22"/>
+          <w:szCs w:val="22"/>
+        </w:rPr>
+      </w:pPr>
+      <w:r>
+        <w:rPr>
+          <w:rFonts w:ascii="Times New Roman" w:hAnsi="Times New Roman" w:cs="Times New Roman"/>
+          <w:b/>
+          <w:bCs/>
+          <w:noProof/>
+          <w:sz w:val="22"/>
+          <w:szCs w:val="22"/>
+        </w:rPr>
+        <w:drawing>
+          <wp:inline distT="0" distB="0" distL="0" distR="0" wp14:anchorId="5A217D01" wp14:editId="612F8AAC">
+            <wp:extent cx="5934075" cy="1209675"/>
+            <wp:effectExtent l="0" t="0" r="9525" b="9525"/>
+            <wp:docPr id="1201319259" name="Picture 1"/>
+            <wp:cNvGraphicFramePr>
+              <a:graphicFrameLocks xmlns:a="http://schemas.openxmlformats.org/drawingml/2006/main" noChangeAspect="1"/>
+            </wp:cNvGraphicFramePr>
+            <a:graphic xmlns:a="http://schemas.openxmlformats.org/drawingml/2006/main">
+              <a:graphicData uri="http://schemas.openxmlformats.org/drawingml/2006/picture">
+                <pic:pic xmlns:pic="http://schemas.openxmlformats.org/drawingml/2006/picture">
+                  <pic:nvPicPr>
+                    <pic:cNvPr id="0" name="Picture 1"/>
+                    <pic:cNvPicPr>
+                      <a:picLocks noChangeAspect="1" noChangeArrowheads="1"/>
+                    </pic:cNvPicPr>
+                  </pic:nvPicPr>
+                  <pic:blipFill>
+                    <a:blip r:embed="rId4" cstate="print">
+                      <a:extLst>
+                        <a:ext uri="{28A0092B-C50C-407E-A947-70E740481C1C}">
+                          <a14:useLocalDpi xmlns:a14="http://schemas.microsoft.com/office/drawing/2010/main" val="0"/>
+                        </a:ext>
+                      </a:extLst>
+                    </a:blip>
+                    <a:srcRect/>
+                    <a:stretch>
+                      <a:fillRect/>
+                    </a:stretch>
+                  </pic:blipFill>
+                  <pic:spPr bwMode="auto">
+                    <a:xfrm>
+                      <a:off x="0" y="0"/>
+                      <a:ext cx="5934075" cy="1209675"/>
+                    </a:xfrm>
+                    <a:prstGeom prst="rect">
+                      <a:avLst/>
+                    </a:prstGeom>
+                    <a:noFill/>
+                    <a:ln>
+                      <a:noFill/>
+                    </a:ln>
+                  </pic:spPr>
+                </pic:pic>
+              </a:graphicData>
+            </a:graphic>
+          </wp:inline>
+        </w:drawing>
+      </w:r>
+    </w:p>
+    <w:p>
+      <w:pPr>
+        <w:rPr>
+          <w:rFonts w:ascii="Times New Roman" w:hAnsi="Times New Roman" w:cs="Times New Roman"/>
+          <w:sz w:val="22"/>
+          <w:szCs w:val="22"/>
+        </w:rPr>
+      </w:pPr>
+      <w:r>
+        <w:rPr>
+          <w:rFonts w:ascii="Times New Roman" w:hAnsi="Times New Roman" w:cs="Times New Roman"/>
+          <w:sz w:val="22"/>
+          <w:szCs w:val="22"/>
+        </w:rPr>
+        <w:t>There’s a lot I learned from hindsight alone.</w:t>
+      </w:r>
+      <w:r>
+        <w:rPr>
+          <w:rFonts w:ascii="Times New Roman" w:hAnsi="Times New Roman" w:cs="Times New Roman"/>
+          <w:sz w:val="22"/>
+          <w:szCs w:val="22"/>
+        </w:rPr>
+        <w:t xml:space="preserve"> One of the mistakes I made was not presenting an easier </w:t>
+      </w:r>
+      <w:r>
+        <w:rPr>
+          <w:rFonts w:ascii="Times New Roman" w:hAnsi="Times New Roman" w:cs="Times New Roman"/>
+          <w:sz w:val="22"/>
+          <w:szCs w:val="22"/>
+        </w:rPr>
+        <w:t>workflow</w:t>
+      </w:r>
+      <w:r>
+        <w:rPr>
+          <w:rFonts w:ascii="Times New Roman" w:hAnsi="Times New Roman" w:cs="Times New Roman"/>
+          <w:sz w:val="22"/>
+          <w:szCs w:val="22"/>
+        </w:rPr>
+        <w:t xml:space="preserve"> for my teammate</w:t>
+      </w:r>
+      <w:r>
+        <w:rPr>
+          <w:rFonts w:ascii="Times New Roman" w:hAnsi="Times New Roman" w:cs="Times New Roman"/>
+          <w:sz w:val="22"/>
+          <w:szCs w:val="22"/>
+        </w:rPr>
+        <w:t>s</w:t>
+      </w:r>
+      <w:r>
+        <w:rPr>
+          <w:rFonts w:ascii="Times New Roman" w:hAnsi="Times New Roman" w:cs="Times New Roman"/>
+          <w:sz w:val="22"/>
+          <w:szCs w:val="22"/>
+        </w:rPr>
+        <w:t xml:space="preserve"> to use to help in filling out the weekly build checklist. I had help with milestones usually but for each other week it was usually just me filling things out at the last moment</w:t>
+      </w:r>
+      <w:r>
+        <w:rPr>
+          <w:rFonts w:ascii="Times New Roman" w:hAnsi="Times New Roman" w:cs="Times New Roman"/>
+          <w:sz w:val="22"/>
+          <w:szCs w:val="22"/>
+        </w:rPr>
+        <w:t xml:space="preserve"> due to other classes and other projects</w:t>
+      </w:r>
+      <w:r>
+        <w:rPr>
+          <w:rFonts w:ascii="Times New Roman" w:hAnsi="Times New Roman" w:cs="Times New Roman"/>
+          <w:sz w:val="22"/>
+          <w:szCs w:val="22"/>
+        </w:rPr>
+        <w:t xml:space="preserve">. If I had created the checklists earlier the team would be able to use them. Reasons for that were usually people needed more time to add something new, otherwise it would end up being the same exact build as before </w:t>
+      </w:r>
+      <w:r>
+        <w:rPr>
+          <w:rFonts w:ascii="Times New Roman" w:hAnsi="Times New Roman" w:cs="Times New Roman"/>
+          <w:sz w:val="22"/>
+          <w:szCs w:val="22"/>
+        </w:rPr>
+        <w:t>which did not look good, so our producer tried to have everyone get something added in</w:t>
+      </w:r>
+      <w:r>
+        <w:rPr>
+          <w:rFonts w:ascii="Times New Roman" w:hAnsi="Times New Roman" w:cs="Times New Roman"/>
+          <w:sz w:val="22"/>
+          <w:szCs w:val="22"/>
+        </w:rPr>
+        <w:t>.</w:t>
+      </w:r>
+      <w:r>
+        <w:rPr>
+          <w:rFonts w:ascii="Times New Roman" w:hAnsi="Times New Roman" w:cs="Times New Roman"/>
+          <w:sz w:val="22"/>
+          <w:szCs w:val="22"/>
+        </w:rPr>
+        <w:t xml:space="preserve"> The biggest problem I had which also was a mistake was that there were some things I couldn’t test properly since they weren’t my field at all in terms of what our project lead would be grading on. Specifically, audio and art for the game were parts I couldn’t test as well or </w:t>
+      </w:r>
+      <w:r>
+        <w:rPr>
+          <w:rFonts w:ascii="Times New Roman" w:hAnsi="Times New Roman" w:cs="Times New Roman"/>
+          <w:sz w:val="22"/>
+          <w:szCs w:val="22"/>
+        </w:rPr>
+        <w:lastRenderedPageBreak/>
+        <w:t xml:space="preserve">with an attached perspective; so, I only had the view of a new player for those aspects. </w:t>
+      </w:r>
+      <w:r>
+        <w:rPr>
+          <w:rFonts w:ascii="Times New Roman" w:hAnsi="Times New Roman" w:cs="Times New Roman"/>
+          <w:sz w:val="22"/>
+          <w:szCs w:val="22"/>
+        </w:rPr>
+        <w:t xml:space="preserve">One person from each discipline is the best solution for what we were going through. It would have been a great way for my other members to understand how it was interacting with other elements of the game and help keep us all more connected to the games original vision. </w:t>
+      </w:r>
+    </w:p>
+    <w:p>
+      <w:pPr>
+        <w:rPr>
+          <w:rFonts w:ascii="Times New Roman" w:hAnsi="Times New Roman" w:cs="Times New Roman"/>
+          <w:b/>
+          <w:bCs/>
+          <w:sz w:val="22"/>
+          <w:szCs w:val="22"/>
+        </w:rPr>
+      </w:pPr>
+      <w:r>
+        <w:rPr>
+          <w:rFonts w:ascii="Times New Roman" w:hAnsi="Times New Roman" w:cs="Times New Roman"/>
+          <w:b/>
+          <w:bCs/>
+          <w:sz w:val="22"/>
+          <w:szCs w:val="22"/>
+        </w:rPr>
+        <w:t>Moth Manager</w:t>
+      </w:r>
+    </w:p>
+    <w:p>
+      <w:pPr>
+        <w:rPr>
+          <w:rFonts w:ascii="Times New Roman" w:hAnsi="Times New Roman" w:cs="Times New Roman"/>
+          <w:sz w:val="22"/>
+          <w:szCs w:val="22"/>
+        </w:rPr>
+      </w:pPr>
+      <w:r>
+        <w:rPr>
+          <w:rFonts w:ascii="Times New Roman" w:hAnsi="Times New Roman" w:cs="Times New Roman"/>
+          <w:sz w:val="22"/>
+          <w:szCs w:val="22"/>
+        </w:rPr>
+        <w:t>Base for managing which moths had been caught</w:t>
+      </w:r>
+    </w:p>
+    <w:p>
+      <w:pPr>
+        <w:rPr>
+          <w:rFonts w:ascii="Times New Roman" w:hAnsi="Times New Roman" w:cs="Times New Roman"/>
+          <w:b/>
+          <w:bCs/>
+          <w:sz w:val="22"/>
+          <w:szCs w:val="22"/>
+        </w:rPr>
+      </w:pPr>
+      <w:r>
+        <w:rPr>
+          <w:rFonts w:ascii="Times New Roman" w:hAnsi="Times New Roman" w:cs="Times New Roman"/>
+          <w:b/>
+          <w:bCs/>
+          <w:sz w:val="22"/>
+          <w:szCs w:val="22"/>
+        </w:rPr>
+        <w:t>Companion Moths</w:t>
+      </w:r>
+    </w:p>
+    <w:p>
+      <w:pPr>
+        <w:rPr>
+          <w:rFonts w:ascii="Times New Roman" w:hAnsi="Times New Roman" w:cs="Times New Roman"/>
+          <w:sz w:val="22"/>
+          <w:szCs w:val="22"/>
+        </w:rPr>
+      </w:pPr>
+      <w:r>
+        <w:rPr>
+          <w:rFonts w:ascii="Times New Roman" w:hAnsi="Times New Roman" w:cs="Times New Roman"/>
+          <w:sz w:val="22"/>
+          <w:szCs w:val="22"/>
+        </w:rPr>
+        <w:t xml:space="preserve">Key Points: Designed a framework for Louis to work off of and implement the functions for each moth. Implemented some of the creative features myself. Worked on getting animations to play. </w:t>
+      </w:r>
+    </w:p>
+    <w:p>
+      <w:pPr>
+        <w:rPr>
+          <w:rFonts w:ascii="Times New Roman" w:hAnsi="Times New Roman" w:cs="Times New Roman"/>
+          <w:sz w:val="22"/>
+          <w:szCs w:val="22"/>
+        </w:rPr>
+      </w:pPr>
+      <w:r>
+        <w:rPr>
+          <w:rFonts w:ascii="Times New Roman" w:hAnsi="Times New Roman" w:cs="Times New Roman"/>
+          <w:sz w:val="22"/>
+          <w:szCs w:val="22"/>
+        </w:rPr>
+        <w:t>What are they?</w:t>
+      </w:r>
+    </w:p>
+    <w:p>
+      <w:pPr>
+        <w:rPr>
+          <w:rFonts w:ascii="Times New Roman" w:hAnsi="Times New Roman" w:cs="Times New Roman"/>
+          <w:sz w:val="22"/>
+          <w:szCs w:val="22"/>
+        </w:rPr>
+      </w:pPr>
+      <w:r>
+        <w:rPr>
+          <w:rFonts w:ascii="Times New Roman" w:hAnsi="Times New Roman" w:cs="Times New Roman"/>
+          <w:sz w:val="22"/>
+          <w:szCs w:val="22"/>
+        </w:rPr>
+        <w:t>The concept of the companion moths in the game quickly became a very big favorite among the team and anyone we would show. The idea stemmed from using them a general idea of progression and game manipulation</w:t>
+      </w:r>
+      <w:r>
+        <w:rPr>
+          <w:rFonts w:ascii="Times New Roman" w:hAnsi="Times New Roman" w:cs="Times New Roman"/>
+          <w:sz w:val="22"/>
+          <w:szCs w:val="22"/>
+        </w:rPr>
+        <w:t>;</w:t>
+      </w:r>
+      <w:r>
+        <w:rPr>
+          <w:rFonts w:ascii="Times New Roman" w:hAnsi="Times New Roman" w:cs="Times New Roman"/>
+          <w:sz w:val="22"/>
+          <w:szCs w:val="22"/>
+        </w:rPr>
+        <w:t xml:space="preserve"> specifically with abilities such as incredible jumping power and fast paced movement. The power the moths shared came directly from the quality of it so a quality of 100, the soft maximum, </w:t>
+      </w:r>
+      <w:r>
+        <w:rPr>
+          <w:rFonts w:ascii="Times New Roman" w:hAnsi="Times New Roman" w:cs="Times New Roman"/>
+          <w:sz w:val="22"/>
+          <w:szCs w:val="22"/>
+        </w:rPr>
+        <w:t>created unique ways to play the game</w:t>
+      </w:r>
+      <w:r>
+        <w:rPr>
+          <w:rFonts w:ascii="Times New Roman" w:hAnsi="Times New Roman" w:cs="Times New Roman"/>
+          <w:sz w:val="22"/>
+          <w:szCs w:val="22"/>
+        </w:rPr>
+        <w:t xml:space="preserve"> – even stacking the same abilities if both moths equipped are the same</w:t>
+      </w:r>
+      <w:r>
+        <w:rPr>
+          <w:rFonts w:ascii="Times New Roman" w:hAnsi="Times New Roman" w:cs="Times New Roman"/>
+          <w:sz w:val="22"/>
+          <w:szCs w:val="22"/>
+        </w:rPr>
+        <w:t>.</w:t>
+      </w:r>
+    </w:p>
+    <w:p>
+      <w:pPr>
+        <w:rPr>
+          <w:rFonts w:ascii="Times New Roman" w:hAnsi="Times New Roman" w:cs="Times New Roman"/>
+          <w:sz w:val="22"/>
+          <w:szCs w:val="22"/>
+        </w:rPr>
+      </w:pPr>
+      <w:r>
+        <w:rPr>
+          <w:rFonts w:ascii="Times New Roman" w:hAnsi="Times New Roman" w:cs="Times New Roman"/>
+          <w:sz w:val="22"/>
+          <w:szCs w:val="22"/>
+        </w:rPr>
+        <w:t>What I did:</w:t>
+      </w:r>
+    </w:p>
+    <w:p>
+      <w:pPr>
+        <w:rPr>
+          <w:rFonts w:ascii="Times New Roman" w:hAnsi="Times New Roman" w:cs="Times New Roman"/>
+          <w:sz w:val="22"/>
+          <w:szCs w:val="22"/>
+        </w:rPr>
+      </w:pPr>
+      <w:r>
+        <w:rPr>
+          <w:rFonts w:ascii="Times New Roman" w:hAnsi="Times New Roman" w:cs="Times New Roman"/>
+          <w:sz w:val="22"/>
+          <w:szCs w:val="22"/>
+        </w:rPr>
+        <w:t>There were two important things I needed to design to start both of these off. I previously had put a lot of time into creating the “Moth Manager” system which kept track of existing moths and whether they had been caught which was done before hand Second was the “Companion Manager” in the game. It held every function that would handle triggering when the new moth was equipped or unequipped which was vital in managing when the new behavior was to be applied or removed. Additionally this was a means to play the moths animation of running up the players arm as well as how you could grab the current equipped effect which would later be important for the inventory UI</w:t>
+      </w:r>
+      <w:commentRangeStart w:id="0"/>
+      <w:r>
+        <w:rPr>
+          <w:rFonts w:ascii="Times New Roman" w:hAnsi="Times New Roman" w:cs="Times New Roman"/>
+          <w:sz w:val="22"/>
+          <w:szCs w:val="22"/>
+        </w:rPr>
+        <w:t xml:space="preserve">.  </w:t>
+      </w:r>
+      <w:commentRangeEnd w:id="0"/>
+      <w:r>
+        <w:rPr>
+          <w:rStyle w:val="CommentReference"/>
+          <w:rFonts w:ascii="Times New Roman" w:hAnsi="Times New Roman" w:cs="Times New Roman"/>
+          <w:sz w:val="22"/>
+          <w:szCs w:val="22"/>
+        </w:rPr>
+        <w:commentReference w:id="0"/>
+      </w:r>
+    </w:p>
+    <w:p>
+      <w:pPr>
+        <w:rPr>
+          <w:rFonts w:ascii="Times New Roman" w:hAnsi="Times New Roman" w:cs="Times New Roman"/>
+          <w:sz w:val="22"/>
+          <w:szCs w:val="22"/>
+        </w:rPr>
+      </w:pPr>
+      <w:r>
+        <w:rPr>
+          <w:rFonts w:ascii="Times New Roman" w:hAnsi="Times New Roman" w:cs="Times New Roman"/>
+          <w:sz w:val="22"/>
+          <w:szCs w:val="22"/>
+        </w:rPr>
+        <w:t xml:space="preserve">Equipping these moths gave the player these abilities and I designed the framework that allowed us to implement these mechanics fast and efficiently. </w:t>
+      </w:r>
+      <w:r>
+        <w:rPr>
+          <w:rFonts w:ascii="Times New Roman" w:hAnsi="Times New Roman" w:cs="Times New Roman"/>
+          <w:sz w:val="22"/>
+          <w:szCs w:val="22"/>
+        </w:rPr>
+        <w:t xml:space="preserve">As my first introduction to unreal there is and was a lot for me to learn and I used the opportunity with this mechanic to learn </w:t>
+      </w:r>
+      <w:r>
+        <w:rPr>
+          <w:rFonts w:ascii="Times New Roman" w:hAnsi="Times New Roman" w:cs="Times New Roman"/>
+          <w:sz w:val="22"/>
+          <w:szCs w:val="22"/>
+        </w:rPr>
+        <w:t xml:space="preserve">how to use C++ in unreal. </w:t>
+      </w:r>
+      <w:r>
+        <w:rPr>
+          <w:rFonts w:ascii="Times New Roman" w:hAnsi="Times New Roman" w:cs="Times New Roman"/>
+          <w:sz w:val="22"/>
+          <w:szCs w:val="22"/>
+        </w:rPr>
+        <w:t xml:space="preserve">I mostly did this through </w:t>
+      </w:r>
+      <w:r>
+        <w:rPr>
+          <w:rFonts w:ascii="Times New Roman" w:hAnsi="Times New Roman" w:cs="Times New Roman"/>
+          <w:sz w:val="22"/>
+          <w:szCs w:val="22"/>
+        </w:rPr>
+        <w:t>inheritance,</w:t>
+      </w:r>
+      <w:r>
+        <w:rPr>
+          <w:rFonts w:ascii="Times New Roman" w:hAnsi="Times New Roman" w:cs="Times New Roman"/>
+          <w:sz w:val="22"/>
+          <w:szCs w:val="22"/>
+        </w:rPr>
+        <w:t xml:space="preserve"> </w:t>
+      </w:r>
+      <w:r>
+        <w:rPr>
+          <w:rFonts w:ascii="Times New Roman" w:hAnsi="Times New Roman" w:cs="Times New Roman"/>
+          <w:sz w:val="22"/>
+          <w:szCs w:val="22"/>
+        </w:rPr>
+        <w:t xml:space="preserve">starting small with a base class that would then </w:t>
+      </w:r>
+      <w:r>
+        <w:rPr>
+          <w:rFonts w:ascii="Times New Roman" w:hAnsi="Times New Roman" w:cs="Times New Roman"/>
+          <w:sz w:val="22"/>
+          <w:szCs w:val="22"/>
+        </w:rPr>
+        <w:t>allow</w:t>
+      </w:r>
+      <w:r>
+        <w:rPr>
+          <w:rFonts w:ascii="Times New Roman" w:hAnsi="Times New Roman" w:cs="Times New Roman"/>
+          <w:sz w:val="22"/>
+          <w:szCs w:val="22"/>
+        </w:rPr>
+        <w:t xml:space="preserve"> my teammate to go through and implement the required function that gave the player the ability. I discussed with him specifically since our plan was to share the work and with the base of the work </w:t>
+      </w:r>
+      <w:r>
+        <w:rPr>
+          <w:rFonts w:ascii="Times New Roman" w:hAnsi="Times New Roman" w:cs="Times New Roman"/>
+          <w:sz w:val="22"/>
+          <w:szCs w:val="22"/>
+        </w:rPr>
+        <w:t>done,</w:t>
+      </w:r>
+      <w:r>
+        <w:rPr>
+          <w:rFonts w:ascii="Times New Roman" w:hAnsi="Times New Roman" w:cs="Times New Roman"/>
+          <w:sz w:val="22"/>
+          <w:szCs w:val="22"/>
+        </w:rPr>
+        <w:t xml:space="preserve"> </w:t>
+      </w:r>
+      <w:r>
+        <w:rPr>
+          <w:rFonts w:ascii="Times New Roman" w:hAnsi="Times New Roman" w:cs="Times New Roman"/>
+          <w:sz w:val="22"/>
+          <w:szCs w:val="22"/>
+        </w:rPr>
+        <w:t xml:space="preserve">he implemented 8 of the moths while I implemented all the Moth Frame modifiers.  The </w:t>
+      </w:r>
+      <w:r>
+        <w:rPr>
+          <w:rFonts w:ascii="Times New Roman" w:hAnsi="Times New Roman" w:cs="Times New Roman"/>
+          <w:sz w:val="22"/>
+          <w:szCs w:val="22"/>
+        </w:rPr>
+        <w:t xml:space="preserve">ninth and final moth </w:t>
+      </w:r>
+      <w:r>
+        <w:rPr>
+          <w:rFonts w:ascii="Times New Roman" w:hAnsi="Times New Roman" w:cs="Times New Roman"/>
+          <w:sz w:val="22"/>
+          <w:szCs w:val="22"/>
+        </w:rPr>
+        <w:t xml:space="preserve">I implemented and </w:t>
+      </w:r>
+      <w:r>
+        <w:rPr>
+          <w:rFonts w:ascii="Times New Roman" w:hAnsi="Times New Roman" w:cs="Times New Roman"/>
+          <w:sz w:val="22"/>
+          <w:szCs w:val="22"/>
+        </w:rPr>
+        <w:t xml:space="preserve">its feature was to add a bonus to the other equipped moth </w:t>
+      </w:r>
+      <w:r>
+        <w:rPr>
+          <w:rFonts w:ascii="Times New Roman" w:hAnsi="Times New Roman" w:cs="Times New Roman"/>
+          <w:sz w:val="22"/>
+          <w:szCs w:val="22"/>
+        </w:rPr>
+        <w:t xml:space="preserve">had </w:t>
+      </w:r>
+      <w:r>
+        <w:rPr>
+          <w:rFonts w:ascii="Times New Roman" w:hAnsi="Times New Roman" w:cs="Times New Roman"/>
+          <w:sz w:val="22"/>
+          <w:szCs w:val="22"/>
+        </w:rPr>
+        <w:t>to</w:t>
+      </w:r>
+      <w:r>
+        <w:rPr>
+          <w:rFonts w:ascii="Times New Roman" w:hAnsi="Times New Roman" w:cs="Times New Roman"/>
+          <w:sz w:val="22"/>
+          <w:szCs w:val="22"/>
+        </w:rPr>
+        <w:t xml:space="preserve"> dedicate a lot of time to solve since there was a lot </w:t>
+      </w:r>
+      <w:r>
+        <w:rPr>
+          <w:rFonts w:ascii="Times New Roman" w:hAnsi="Times New Roman" w:cs="Times New Roman"/>
+          <w:sz w:val="22"/>
+          <w:szCs w:val="22"/>
+        </w:rPr>
+        <w:t>situations to consider</w:t>
+      </w:r>
+      <w:r>
+        <w:rPr>
+          <w:rFonts w:ascii="Times New Roman" w:hAnsi="Times New Roman" w:cs="Times New Roman"/>
+          <w:sz w:val="22"/>
+          <w:szCs w:val="22"/>
+        </w:rPr>
+        <w:t>.</w:t>
+      </w:r>
+    </w:p>
+    <w:p>
+      <w:pPr>
+        <w:rPr>
+          <w:rFonts w:ascii="Times New Roman" w:hAnsi="Times New Roman" w:cs="Times New Roman"/>
+          <w:sz w:val="22"/>
+          <w:szCs w:val="22"/>
+        </w:rPr>
+      </w:pPr>
+      <w:r>
+        <w:rPr>
+          <w:rFonts w:ascii="Times New Roman" w:hAnsi="Times New Roman" w:cs="Times New Roman"/>
+          <w:sz w:val="22"/>
+          <w:szCs w:val="22"/>
+        </w:rPr>
+        <w:t xml:space="preserve">The Angel Moth: </w:t>
+      </w:r>
+    </w:p>
+    <w:p>
+      <w:pPr>
+        <w:rPr>
+          <w:rFonts w:ascii="Times New Roman" w:hAnsi="Times New Roman" w:cs="Times New Roman"/>
+          <w:sz w:val="22"/>
+          <w:szCs w:val="22"/>
+        </w:rPr>
+      </w:pPr>
+      <w:r>
+        <w:rPr>
+          <w:rFonts w:ascii="Times New Roman" w:hAnsi="Times New Roman" w:cs="Times New Roman"/>
+          <w:sz w:val="22"/>
+          <w:szCs w:val="22"/>
+        </w:rPr>
+        <w:t>This moth was able to boost the quality of whatever moth you had already equipped</w:t>
+      </w:r>
+      <w:r>
+        <w:rPr>
+          <w:rFonts w:ascii="Times New Roman" w:hAnsi="Times New Roman" w:cs="Times New Roman"/>
+          <w:sz w:val="22"/>
+          <w:szCs w:val="22"/>
+        </w:rPr>
+        <w:t xml:space="preserve"> based on whatever quality the angel has</w:t>
+      </w:r>
+      <w:r>
+        <w:rPr>
+          <w:rFonts w:ascii="Times New Roman" w:hAnsi="Times New Roman" w:cs="Times New Roman"/>
+          <w:sz w:val="22"/>
+          <w:szCs w:val="22"/>
+        </w:rPr>
+        <w:t>. Which mean</w:t>
+      </w:r>
+      <w:r>
+        <w:rPr>
+          <w:rFonts w:ascii="Times New Roman" w:hAnsi="Times New Roman" w:cs="Times New Roman"/>
+          <w:sz w:val="22"/>
+          <w:szCs w:val="22"/>
+        </w:rPr>
+        <w:t>s</w:t>
+      </w:r>
+      <w:r>
+        <w:rPr>
+          <w:rFonts w:ascii="Times New Roman" w:hAnsi="Times New Roman" w:cs="Times New Roman"/>
+          <w:sz w:val="22"/>
+          <w:szCs w:val="22"/>
+        </w:rPr>
+        <w:t xml:space="preserve"> that whatever calculation any moth that would or had already been equipped must do it again with a temporary change of </w:t>
+      </w:r>
+      <w:r>
+        <w:rPr>
+          <w:rFonts w:ascii="Times New Roman" w:hAnsi="Times New Roman" w:cs="Times New Roman"/>
+          <w:sz w:val="22"/>
+          <w:szCs w:val="22"/>
+        </w:rPr>
+        <w:t>quality</w:t>
+      </w:r>
+      <w:r>
+        <w:rPr>
+          <w:rFonts w:ascii="Times New Roman" w:hAnsi="Times New Roman" w:cs="Times New Roman"/>
+          <w:sz w:val="22"/>
+          <w:szCs w:val="22"/>
+        </w:rPr>
+        <w:t>.</w:t>
+      </w:r>
+      <w:r>
+        <w:rPr>
+          <w:rFonts w:ascii="Times New Roman" w:hAnsi="Times New Roman" w:cs="Times New Roman"/>
+          <w:sz w:val="22"/>
+          <w:szCs w:val="22"/>
+        </w:rPr>
+        <w:t xml:space="preserve"> A lot of problems came up with the implementation of this moth specifically just because of the </w:t>
+      </w:r>
+      <w:r>
+        <w:rPr>
+          <w:rFonts w:ascii="Times New Roman" w:hAnsi="Times New Roman" w:cs="Times New Roman"/>
+          <w:sz w:val="22"/>
+          <w:szCs w:val="22"/>
+        </w:rPr>
+        <w:t xml:space="preserve">influence it would have on the entire system </w:t>
+      </w:r>
+      <w:r>
+        <w:rPr>
+          <w:rFonts w:ascii="Times New Roman" w:hAnsi="Times New Roman" w:cs="Times New Roman"/>
+          <w:sz w:val="22"/>
+          <w:szCs w:val="22"/>
+        </w:rPr>
+        <w:lastRenderedPageBreak/>
+        <w:t xml:space="preserve">that I unfortunately had not planned ahead enough to edge case this </w:t>
+      </w:r>
+      <w:r>
+        <w:rPr>
+          <w:rFonts w:ascii="Times New Roman" w:hAnsi="Times New Roman" w:cs="Times New Roman"/>
+          <w:sz w:val="22"/>
+          <w:szCs w:val="22"/>
+        </w:rPr>
+        <w:t>moth specifically. When I first started making it moths still had not been designed yet</w:t>
+      </w:r>
+      <w:r>
+        <w:rPr>
+          <w:rFonts w:ascii="Times New Roman" w:hAnsi="Times New Roman" w:cs="Times New Roman"/>
+          <w:sz w:val="22"/>
+          <w:szCs w:val="22"/>
+        </w:rPr>
+        <w:t xml:space="preserve">. Big bugs </w:t>
+      </w:r>
+      <w:r>
+        <w:rPr>
+          <w:rFonts w:ascii="Times New Roman" w:hAnsi="Times New Roman" w:cs="Times New Roman"/>
+          <w:sz w:val="22"/>
+          <w:szCs w:val="22"/>
+        </w:rPr>
+        <w:t xml:space="preserve">consisted </w:t>
+      </w:r>
+      <w:r>
+        <w:rPr>
+          <w:rFonts w:ascii="Times New Roman" w:hAnsi="Times New Roman" w:cs="Times New Roman"/>
+          <w:sz w:val="22"/>
+          <w:szCs w:val="22"/>
+        </w:rPr>
+        <w:t>of:</w:t>
+      </w:r>
+      <w:r>
+        <w:rPr>
+          <w:rFonts w:ascii="Times New Roman" w:hAnsi="Times New Roman" w:cs="Times New Roman"/>
+          <w:sz w:val="22"/>
+          <w:szCs w:val="22"/>
+        </w:rPr>
+        <w:t xml:space="preserve"> the </w:t>
+      </w:r>
+      <w:r>
+        <w:rPr>
+          <w:rFonts w:ascii="Times New Roman" w:hAnsi="Times New Roman" w:cs="Times New Roman"/>
+          <w:sz w:val="22"/>
+          <w:szCs w:val="22"/>
+        </w:rPr>
+        <w:t>moth it was equipped alongside stacking additional permanent quality</w:t>
+      </w:r>
+      <w:r>
+        <w:rPr>
+          <w:rFonts w:ascii="Times New Roman" w:hAnsi="Times New Roman" w:cs="Times New Roman"/>
+          <w:sz w:val="22"/>
+          <w:szCs w:val="22"/>
+        </w:rPr>
+        <w:t xml:space="preserve"> </w:t>
+      </w:r>
+      <w:r>
+        <w:rPr>
+          <w:rFonts w:ascii="Times New Roman" w:hAnsi="Times New Roman" w:cs="Times New Roman"/>
+          <w:sz w:val="22"/>
+          <w:szCs w:val="22"/>
+        </w:rPr>
+        <w:t>as well as one where</w:t>
+      </w:r>
+      <w:r>
+        <w:rPr>
+          <w:rFonts w:ascii="Times New Roman" w:hAnsi="Times New Roman" w:cs="Times New Roman"/>
+          <w:sz w:val="22"/>
+          <w:szCs w:val="22"/>
+        </w:rPr>
+        <w:t xml:space="preserve"> </w:t>
+      </w:r>
+      <w:r>
+        <w:rPr>
+          <w:rFonts w:ascii="Times New Roman" w:hAnsi="Times New Roman" w:cs="Times New Roman"/>
+          <w:sz w:val="22"/>
+          <w:szCs w:val="22"/>
+        </w:rPr>
+        <w:t xml:space="preserve">they were </w:t>
+      </w:r>
+      <w:r>
+        <w:rPr>
+          <w:rFonts w:ascii="Times New Roman" w:hAnsi="Times New Roman" w:cs="Times New Roman"/>
+          <w:sz w:val="22"/>
+          <w:szCs w:val="22"/>
+        </w:rPr>
+        <w:t xml:space="preserve">not getting any bonus if the angel moth had already been equipped. </w:t>
+      </w:r>
+    </w:p>
+    <w:p>
+      <w:pPr>
+        <w:rPr>
+          <w:rFonts w:ascii="Times New Roman" w:hAnsi="Times New Roman" w:cs="Times New Roman"/>
+          <w:sz w:val="22"/>
+          <w:szCs w:val="22"/>
+        </w:rPr>
+      </w:pPr>
+      <w:r>
+        <w:rPr>
+          <w:rFonts w:ascii="Times New Roman" w:hAnsi="Times New Roman" w:cs="Times New Roman"/>
+          <w:sz w:val="22"/>
+          <w:szCs w:val="22"/>
+        </w:rPr>
+        <w:t xml:space="preserve">The solution </w:t>
+      </w:r>
+      <w:r>
+        <w:rPr>
+          <w:rFonts w:ascii="Times New Roman" w:hAnsi="Times New Roman" w:cs="Times New Roman"/>
+          <w:sz w:val="22"/>
+          <w:szCs w:val="22"/>
+        </w:rPr>
+        <w:t>I came up with</w:t>
+      </w:r>
+      <w:r>
+        <w:rPr>
+          <w:rFonts w:ascii="Times New Roman" w:hAnsi="Times New Roman" w:cs="Times New Roman"/>
+          <w:sz w:val="22"/>
+          <w:szCs w:val="22"/>
+        </w:rPr>
+        <w:t xml:space="preserve"> became </w:t>
+      </w:r>
+      <w:r>
+        <w:rPr>
+          <w:rFonts w:ascii="Times New Roman" w:hAnsi="Times New Roman" w:cs="Times New Roman"/>
+          <w:sz w:val="22"/>
+          <w:szCs w:val="22"/>
+        </w:rPr>
+        <w:t>a</w:t>
+      </w:r>
+      <w:r>
+        <w:rPr>
+          <w:rFonts w:ascii="Times New Roman" w:hAnsi="Times New Roman" w:cs="Times New Roman"/>
+          <w:sz w:val="22"/>
+          <w:szCs w:val="22"/>
+        </w:rPr>
+        <w:t xml:space="preserve"> </w:t>
+      </w:r>
+      <w:r>
+        <w:rPr>
+          <w:rFonts w:ascii="Times New Roman" w:hAnsi="Times New Roman" w:cs="Times New Roman"/>
+          <w:sz w:val="22"/>
+          <w:szCs w:val="22"/>
+        </w:rPr>
+        <w:t xml:space="preserve">rushed </w:t>
+      </w:r>
+      <w:r>
+        <w:rPr>
+          <w:rFonts w:ascii="Times New Roman" w:hAnsi="Times New Roman" w:cs="Times New Roman"/>
+          <w:sz w:val="22"/>
+          <w:szCs w:val="22"/>
+        </w:rPr>
+        <w:t xml:space="preserve">and maybe scrambled </w:t>
+      </w:r>
+      <w:r>
+        <w:rPr>
+          <w:rFonts w:ascii="Times New Roman" w:hAnsi="Times New Roman" w:cs="Times New Roman"/>
+          <w:sz w:val="22"/>
+          <w:szCs w:val="22"/>
+        </w:rPr>
+        <w:t>idea,</w:t>
+      </w:r>
+      <w:r>
+        <w:rPr>
+          <w:rFonts w:ascii="Times New Roman" w:hAnsi="Times New Roman" w:cs="Times New Roman"/>
+          <w:sz w:val="22"/>
+          <w:szCs w:val="22"/>
+        </w:rPr>
+        <w:t xml:space="preserve"> </w:t>
+      </w:r>
+      <w:r>
+        <w:rPr>
+          <w:rFonts w:ascii="Times New Roman" w:hAnsi="Times New Roman" w:cs="Times New Roman"/>
+          <w:sz w:val="22"/>
+          <w:szCs w:val="22"/>
+        </w:rPr>
+        <w:t>but</w:t>
+      </w:r>
+      <w:r>
+        <w:rPr>
+          <w:rFonts w:ascii="Times New Roman" w:hAnsi="Times New Roman" w:cs="Times New Roman"/>
+          <w:sz w:val="22"/>
+          <w:szCs w:val="22"/>
+        </w:rPr>
+        <w:t xml:space="preserve"> it managed to work.</w:t>
+      </w:r>
+      <w:r>
+        <w:rPr>
+          <w:rFonts w:ascii="Times New Roman" w:hAnsi="Times New Roman" w:cs="Times New Roman"/>
+          <w:sz w:val="22"/>
+          <w:szCs w:val="22"/>
+        </w:rPr>
+        <w:t xml:space="preserve"> </w:t>
+      </w:r>
+      <w:r>
+        <w:rPr>
+          <w:rFonts w:ascii="Times New Roman" w:hAnsi="Times New Roman" w:cs="Times New Roman"/>
+          <w:sz w:val="22"/>
+          <w:szCs w:val="22"/>
+        </w:rPr>
+        <w:t>I</w:t>
+      </w:r>
+      <w:r>
+        <w:rPr>
+          <w:rFonts w:ascii="Times New Roman" w:hAnsi="Times New Roman" w:cs="Times New Roman"/>
+          <w:sz w:val="22"/>
+          <w:szCs w:val="22"/>
+        </w:rPr>
+        <w:t xml:space="preserve">n the end I </w:t>
+      </w:r>
+      <w:r>
+        <w:rPr>
+          <w:rFonts w:ascii="Times New Roman" w:hAnsi="Times New Roman" w:cs="Times New Roman"/>
+          <w:sz w:val="22"/>
+          <w:szCs w:val="22"/>
+        </w:rPr>
+        <w:t>created another virtual function within the base class</w:t>
+      </w:r>
+      <w:r>
+        <w:rPr>
+          <w:rFonts w:ascii="Times New Roman" w:hAnsi="Times New Roman" w:cs="Times New Roman"/>
+          <w:sz w:val="22"/>
+          <w:szCs w:val="22"/>
+        </w:rPr>
+        <w:t xml:space="preserve"> specifically for refreshing with a new quality</w:t>
+      </w:r>
+      <w:r>
+        <w:rPr>
+          <w:rFonts w:ascii="Times New Roman" w:hAnsi="Times New Roman" w:cs="Times New Roman"/>
+          <w:sz w:val="22"/>
+          <w:szCs w:val="22"/>
+        </w:rPr>
+        <w:t xml:space="preserve"> – which did mean going through every moth again to accommodate the new behavior. </w:t>
+      </w:r>
+      <w:r>
+        <w:rPr>
+          <w:rFonts w:ascii="Times New Roman" w:hAnsi="Times New Roman" w:cs="Times New Roman"/>
+          <w:sz w:val="22"/>
+          <w:szCs w:val="22"/>
+        </w:rPr>
+        <w:t xml:space="preserve">Creating a modifier variable in the manager also </w:t>
+      </w:r>
+      <w:r>
+        <w:rPr>
+          <w:rFonts w:ascii="Times New Roman" w:hAnsi="Times New Roman" w:cs="Times New Roman"/>
+          <w:sz w:val="22"/>
+          <w:szCs w:val="22"/>
+        </w:rPr>
+        <w:t>became</w:t>
+      </w:r>
+      <w:r>
+        <w:rPr>
+          <w:rFonts w:ascii="Times New Roman" w:hAnsi="Times New Roman" w:cs="Times New Roman"/>
+          <w:sz w:val="22"/>
+          <w:szCs w:val="22"/>
+        </w:rPr>
+        <w:t xml:space="preserve"> a part of </w:t>
+      </w:r>
+      <w:r>
+        <w:rPr>
+          <w:rFonts w:ascii="Times New Roman" w:hAnsi="Times New Roman" w:cs="Times New Roman"/>
+          <w:sz w:val="22"/>
+          <w:szCs w:val="22"/>
+        </w:rPr>
+        <w:t xml:space="preserve">the solution so </w:t>
+      </w:r>
+      <w:r>
+        <w:rPr>
+          <w:rFonts w:ascii="Times New Roman" w:hAnsi="Times New Roman" w:cs="Times New Roman"/>
+          <w:sz w:val="22"/>
+          <w:szCs w:val="22"/>
+        </w:rPr>
+        <w:t>systems that worked outside and within the companion manager</w:t>
+      </w:r>
+      <w:r>
+        <w:rPr>
+          <w:rFonts w:ascii="Times New Roman" w:hAnsi="Times New Roman" w:cs="Times New Roman"/>
+          <w:sz w:val="22"/>
+          <w:szCs w:val="22"/>
+        </w:rPr>
+        <w:t xml:space="preserve"> were able to see what the change would be</w:t>
+      </w:r>
+      <w:r>
+        <w:rPr>
+          <w:rFonts w:ascii="Times New Roman" w:hAnsi="Times New Roman" w:cs="Times New Roman"/>
+          <w:sz w:val="22"/>
+          <w:szCs w:val="22"/>
+        </w:rPr>
+        <w:t xml:space="preserve">. Within the companion manager I would use the modifier </w:t>
+      </w:r>
+      <w:r>
+        <w:rPr>
+          <w:rFonts w:ascii="Times New Roman" w:hAnsi="Times New Roman" w:cs="Times New Roman"/>
+          <w:sz w:val="22"/>
+          <w:szCs w:val="22"/>
+        </w:rPr>
+        <w:t xml:space="preserve">for </w:t>
+      </w:r>
+      <w:r>
+        <w:rPr>
+          <w:rFonts w:ascii="Times New Roman" w:hAnsi="Times New Roman" w:cs="Times New Roman"/>
+          <w:sz w:val="22"/>
+          <w:szCs w:val="22"/>
+        </w:rPr>
+        <w:t xml:space="preserve">creating the companion moth object </w:t>
+      </w:r>
+      <w:r>
+        <w:rPr>
+          <w:rFonts w:ascii="Times New Roman" w:hAnsi="Times New Roman" w:cs="Times New Roman"/>
+          <w:sz w:val="22"/>
+          <w:szCs w:val="22"/>
+        </w:rPr>
+        <w:t>which fixed the problem of if an angel moth was already equipped.</w:t>
+      </w:r>
+      <w:r>
+        <w:rPr>
+          <w:rFonts w:ascii="Times New Roman" w:hAnsi="Times New Roman" w:cs="Times New Roman"/>
+          <w:sz w:val="22"/>
+          <w:szCs w:val="22"/>
+        </w:rPr>
+        <w:t xml:space="preserve"> </w:t>
+      </w:r>
+      <w:r>
+        <w:rPr>
+          <w:rFonts w:ascii="Times New Roman" w:hAnsi="Times New Roman" w:cs="Times New Roman"/>
+          <w:sz w:val="22"/>
+          <w:szCs w:val="22"/>
+        </w:rPr>
+        <w:t>[consider blueprint examples]</w:t>
+      </w:r>
+    </w:p>
+    <w:p>
+      <w:pPr>
+        <w:rPr>
+          <w:rFonts w:ascii="Times New Roman" w:hAnsi="Times New Roman" w:cs="Times New Roman"/>
+          <w:b/>
+          <w:bCs/>
+          <w:sz w:val="22"/>
+          <w:szCs w:val="22"/>
+        </w:rPr>
+      </w:pPr>
+      <w:r>
+        <w:rPr>
+          <w:rFonts w:ascii="Times New Roman" w:hAnsi="Times New Roman" w:cs="Times New Roman"/>
+          <w:b/>
+          <w:bCs/>
+          <w:sz w:val="22"/>
+          <w:szCs w:val="22"/>
+        </w:rPr>
+        <w:t>Breeding Tank</w:t>
+      </w:r>
+    </w:p>
+    <w:p>
+      <w:pPr>
+        <w:rPr>
+          <w:rFonts w:ascii="Times New Roman" w:hAnsi="Times New Roman" w:cs="Times New Roman"/>
+          <w:sz w:val="22"/>
+          <w:szCs w:val="22"/>
+        </w:rPr>
+      </w:pPr>
+      <w:r>
+        <w:rPr>
+          <w:rFonts w:ascii="Times New Roman" w:hAnsi="Times New Roman" w:cs="Times New Roman"/>
+          <w:sz w:val="22"/>
+          <w:szCs w:val="22"/>
+        </w:rPr>
+        <w:t>Key Points: Calculation for output, quick keys and managing the timers for different stages (</w:t>
+      </w:r>
+      <w:r>
+        <w:rPr>
+          <w:rFonts w:ascii="Times New Roman" w:hAnsi="Times New Roman" w:cs="Times New Roman"/>
+          <w:sz w:val="22"/>
+          <w:szCs w:val="22"/>
+        </w:rPr>
+        <w:t>deprecated</w:t>
+      </w:r>
+      <w:r>
+        <w:rPr>
+          <w:rFonts w:ascii="Times New Roman" w:hAnsi="Times New Roman" w:cs="Times New Roman"/>
+          <w:sz w:val="22"/>
+          <w:szCs w:val="22"/>
+        </w:rPr>
+        <w:t>)</w:t>
+      </w:r>
+    </w:p>
+    <w:p>
+      <w:pPr>
+        <w:rPr>
+          <w:rFonts w:ascii="Times New Roman" w:hAnsi="Times New Roman" w:cs="Times New Roman"/>
+          <w:sz w:val="22"/>
+          <w:szCs w:val="22"/>
+        </w:rPr>
+      </w:pPr>
+      <w:r>
+        <w:rPr>
+          <w:rFonts w:ascii="Times New Roman" w:hAnsi="Times New Roman" w:cs="Times New Roman"/>
+          <w:sz w:val="22"/>
+          <w:szCs w:val="22"/>
+        </w:rPr>
+        <w:t xml:space="preserve">For the breeding tank I was responsible for setting up the interactable object that players would see as well as its main feature. </w:t>
+      </w:r>
+    </w:p>
+    <w:p>
+      <w:pPr>
+        <w:rPr>
+          <w:rFonts w:ascii="Times New Roman" w:hAnsi="Times New Roman" w:cs="Times New Roman"/>
+          <w:b/>
+          <w:bCs/>
+          <w:sz w:val="22"/>
+          <w:szCs w:val="22"/>
+        </w:rPr>
+      </w:pPr>
+      <w:r>
+        <w:rPr>
+          <w:rFonts w:ascii="Times New Roman" w:hAnsi="Times New Roman" w:cs="Times New Roman"/>
+          <w:b/>
+          <w:bCs/>
+          <w:sz w:val="22"/>
+          <w:szCs w:val="22"/>
+        </w:rPr>
+        <w:t>Moth Frame</w:t>
+      </w:r>
+    </w:p>
+    <w:p>
+      <w:pPr>
+        <w:rPr>
+          <w:rFonts w:ascii="Times New Roman" w:hAnsi="Times New Roman" w:cs="Times New Roman"/>
+          <w:sz w:val="22"/>
+          <w:szCs w:val="22"/>
+        </w:rPr>
+      </w:pPr>
+      <w:r>
+        <w:rPr>
+          <w:rFonts w:ascii="Times New Roman" w:hAnsi="Times New Roman" w:cs="Times New Roman"/>
+          <w:sz w:val="22"/>
+          <w:szCs w:val="22"/>
+        </w:rPr>
+        <w:t xml:space="preserve">Found the idea for a singleton class style implementation for stat modifiers. </w:t>
+      </w:r>
+    </w:p>
+    <w:p>
+      <w:pPr>
+        <w:rPr>
+          <w:rFonts w:ascii="Times New Roman" w:hAnsi="Times New Roman" w:cs="Times New Roman"/>
+          <w:b/>
+          <w:bCs/>
+          <w:sz w:val="22"/>
+          <w:szCs w:val="22"/>
+        </w:rPr>
+      </w:pPr>
+      <w:r>
+        <w:rPr>
+          <w:rFonts w:ascii="Times New Roman" w:hAnsi="Times New Roman" w:cs="Times New Roman"/>
+          <w:b/>
+          <w:bCs/>
+          <w:sz w:val="22"/>
+          <w:szCs w:val="22"/>
+        </w:rPr>
+        <w:t>Final Thoughts</w:t>
+      </w:r>
+    </w:p>
+    <w:p>
+      <w:pPr>
+        <w:rPr>
+          <w:rFonts w:ascii="Times New Roman" w:hAnsi="Times New Roman" w:cs="Times New Roman"/>
+          <w:sz w:val="22"/>
+          <w:szCs w:val="22"/>
+        </w:rPr>
+      </w:pPr>
+      <w:r>
+        <w:rPr>
+          <w:rFonts w:ascii="Times New Roman" w:hAnsi="Times New Roman" w:cs="Times New Roman"/>
+          <w:sz w:val="22"/>
+          <w:szCs w:val="22"/>
+        </w:rPr>
+        <w:t xml:space="preserve">UX and optimization skills are skills I want to develop further due to issues on the game. </w:t>
+      </w:r>
+    </w:p>
+    <w:p>
+      <w:pPr>
+        <w:rPr>
+          <w:rFonts w:ascii="Times New Roman" w:hAnsi="Times New Roman" w:cs="Times New Roman"/>
+          <w:sz w:val="22"/>
+          <w:szCs w:val="22"/>
+        </w:rPr>
+      </w:pPr>
+    </w:p>
+    <w:p>
+      <w:pPr>
+        <w:rPr>
+          <w:rFonts w:ascii="Times New Roman" w:hAnsi="Times New Roman" w:cs="Times New Roman"/>
+          <w:sz w:val="22"/>
+          <w:szCs w:val="22"/>
+        </w:rPr>
+      </w:pPr>
+      <w:commentRangeStart w:id="1"/>
+      <w:r>
+        <w:rPr>
+          <w:rFonts w:ascii="Times New Roman" w:hAnsi="Times New Roman" w:cs="Times New Roman"/>
+          <w:sz w:val="22"/>
+          <w:szCs w:val="22"/>
+        </w:rPr>
+        <w:t xml:space="preserve">This project gave me a great opportunity to experience the </w:t>
+      </w:r>
+      <w:r>
+        <w:rPr>
+          <w:rFonts w:ascii="Times New Roman" w:hAnsi="Times New Roman" w:cs="Times New Roman"/>
+          <w:sz w:val="22"/>
+          <w:szCs w:val="22"/>
+        </w:rPr>
+        <w:t>workflow</w:t>
+      </w:r>
+      <w:r>
+        <w:rPr>
+          <w:rFonts w:ascii="Times New Roman" w:hAnsi="Times New Roman" w:cs="Times New Roman"/>
+          <w:sz w:val="22"/>
+          <w:szCs w:val="22"/>
+        </w:rPr>
+        <w:t xml:space="preserve"> and care needed</w:t>
+      </w:r>
+      <w:r>
+        <w:rPr>
+          <w:rFonts w:ascii="Times New Roman" w:hAnsi="Times New Roman" w:cs="Times New Roman"/>
+          <w:sz w:val="22"/>
+          <w:szCs w:val="22"/>
+        </w:rPr>
+        <w:t xml:space="preserve"> for </w:t>
+      </w:r>
+      <w:r>
+        <w:rPr>
+          <w:rFonts w:ascii="Times New Roman" w:hAnsi="Times New Roman" w:cs="Times New Roman"/>
+          <w:sz w:val="22"/>
+          <w:szCs w:val="22"/>
+        </w:rPr>
+        <w:t xml:space="preserve">a </w:t>
+      </w:r>
+      <w:r>
+        <w:rPr>
+          <w:rFonts w:ascii="Times New Roman" w:hAnsi="Times New Roman" w:cs="Times New Roman"/>
+          <w:sz w:val="22"/>
+          <w:szCs w:val="22"/>
+        </w:rPr>
+        <w:t>2</w:t>
+      </w:r>
+      <w:r>
+        <w:rPr>
+          <w:rFonts w:ascii="Times New Roman" w:hAnsi="Times New Roman" w:cs="Times New Roman"/>
+          <w:sz w:val="22"/>
+          <w:szCs w:val="22"/>
+        </w:rPr>
+        <w:t>2</w:t>
+      </w:r>
+      <w:r>
+        <w:rPr>
+          <w:rFonts w:ascii="Times New Roman" w:hAnsi="Times New Roman" w:cs="Times New Roman"/>
+          <w:sz w:val="22"/>
+          <w:szCs w:val="22"/>
+        </w:rPr>
+        <w:t>-person</w:t>
+      </w:r>
+      <w:r>
+        <w:rPr>
+          <w:rFonts w:ascii="Times New Roman" w:hAnsi="Times New Roman" w:cs="Times New Roman"/>
+          <w:sz w:val="22"/>
+          <w:szCs w:val="22"/>
+        </w:rPr>
+        <w:t xml:space="preserve"> project</w:t>
+      </w:r>
+      <w:r>
+        <w:rPr>
+          <w:rFonts w:ascii="Times New Roman" w:hAnsi="Times New Roman" w:cs="Times New Roman"/>
+          <w:sz w:val="22"/>
+          <w:szCs w:val="22"/>
+        </w:rPr>
+        <w:t xml:space="preserve">. </w:t>
+      </w:r>
+      <w:r>
+        <w:rPr>
+          <w:rFonts w:ascii="Times New Roman" w:hAnsi="Times New Roman" w:cs="Times New Roman"/>
+          <w:sz w:val="22"/>
+          <w:szCs w:val="22"/>
+        </w:rPr>
+        <w:t>I was give</w:t>
+      </w:r>
+      <w:r>
+        <w:rPr>
+          <w:rFonts w:ascii="Times New Roman" w:hAnsi="Times New Roman" w:cs="Times New Roman"/>
+          <w:sz w:val="22"/>
+          <w:szCs w:val="22"/>
+        </w:rPr>
+        <w:t xml:space="preserve">n the chance to take </w:t>
+      </w:r>
+      <w:r>
+        <w:rPr>
+          <w:rFonts w:ascii="Times New Roman" w:hAnsi="Times New Roman" w:cs="Times New Roman"/>
+          <w:sz w:val="22"/>
+          <w:szCs w:val="22"/>
+        </w:rPr>
+        <w:t>the</w:t>
+      </w:r>
+      <w:r>
+        <w:rPr>
+          <w:rFonts w:ascii="Times New Roman" w:hAnsi="Times New Roman" w:cs="Times New Roman"/>
+          <w:sz w:val="22"/>
+          <w:szCs w:val="22"/>
+        </w:rPr>
+        <w:t xml:space="preserve"> role of </w:t>
+      </w:r>
+      <w:r>
+        <w:rPr>
+          <w:rFonts w:ascii="Times New Roman" w:hAnsi="Times New Roman" w:cs="Times New Roman"/>
+          <w:b/>
+          <w:bCs/>
+          <w:sz w:val="22"/>
+          <w:szCs w:val="22"/>
+        </w:rPr>
+        <w:t>quality advocate</w:t>
+      </w:r>
+      <w:r>
+        <w:rPr>
+          <w:rFonts w:ascii="Times New Roman" w:hAnsi="Times New Roman" w:cs="Times New Roman"/>
+          <w:sz w:val="22"/>
+          <w:szCs w:val="22"/>
+        </w:rPr>
+        <w:t xml:space="preserve"> on the team and learned what it meant to be responsible for a large aspect of the game – especially so, since it involved all disciplines on our team. With previous experience as a tech lead for a much smaller project, I had an idea of what would be similar but that under shadowed what I was truly meant to do as I struggled with being truly effective. This was one of the most prominent roles I had on the team but what I </w:t>
+      </w:r>
+      <w:r>
+        <w:rPr>
+          <w:rFonts w:ascii="Times New Roman" w:hAnsi="Times New Roman" w:cs="Times New Roman"/>
+          <w:sz w:val="22"/>
+          <w:szCs w:val="22"/>
+        </w:rPr>
+        <w:t xml:space="preserve">genuinely love and was able to learn more about it in </w:t>
+      </w:r>
+      <w:r>
+        <w:rPr>
+          <w:rFonts w:ascii="Times New Roman" w:hAnsi="Times New Roman" w:cs="Times New Roman"/>
+          <w:sz w:val="22"/>
+          <w:szCs w:val="22"/>
+        </w:rPr>
+        <w:t>U</w:t>
+      </w:r>
+      <w:r>
+        <w:rPr>
+          <w:rFonts w:ascii="Times New Roman" w:hAnsi="Times New Roman" w:cs="Times New Roman"/>
+          <w:sz w:val="22"/>
+          <w:szCs w:val="22"/>
+        </w:rPr>
+        <w:t>nreal was</w:t>
+      </w:r>
+      <w:r>
+        <w:rPr>
+          <w:rFonts w:ascii="Times New Roman" w:hAnsi="Times New Roman" w:cs="Times New Roman"/>
+          <w:sz w:val="22"/>
+          <w:szCs w:val="22"/>
+        </w:rPr>
+        <w:t xml:space="preserve"> even more</w:t>
+      </w:r>
+      <w:r>
+        <w:rPr>
+          <w:rFonts w:ascii="Times New Roman" w:hAnsi="Times New Roman" w:cs="Times New Roman"/>
+          <w:sz w:val="22"/>
+          <w:szCs w:val="22"/>
+        </w:rPr>
+        <w:t xml:space="preserve"> </w:t>
+      </w:r>
+      <w:r>
+        <w:rPr>
+          <w:rFonts w:ascii="Times New Roman" w:hAnsi="Times New Roman" w:cs="Times New Roman"/>
+          <w:b/>
+          <w:bCs/>
+          <w:sz w:val="22"/>
+          <w:szCs w:val="22"/>
+        </w:rPr>
         <w:t>gameplay programming</w:t>
       </w:r>
       <w:r>
@@ -147,8 +2054,43 @@
           <w:sz w:val="22"/>
           <w:szCs w:val="22"/>
         </w:rPr>
-        <w:t xml:space="preserve">. Collaborating with such a large team was a great opportunity for me to learn as much as I can with a people aiming for the same creating a game that would be enjoyable and </w:t>
-      </w:r>
+        <w:t>.</w:t>
+      </w:r>
+      <w:r>
+        <w:rPr>
+          <w:rFonts w:ascii="Times New Roman" w:hAnsi="Times New Roman" w:cs="Times New Roman"/>
+          <w:sz w:val="22"/>
+          <w:szCs w:val="22"/>
+        </w:rPr>
+        <w:t xml:space="preserve"> </w:t>
+      </w:r>
+      <w:r>
+        <w:rPr>
+          <w:rFonts w:ascii="Times New Roman" w:hAnsi="Times New Roman" w:cs="Times New Roman"/>
+          <w:sz w:val="22"/>
+          <w:szCs w:val="22"/>
+        </w:rPr>
+        <w:t xml:space="preserve"> </w:t>
+      </w:r>
+      <w:commentRangeEnd w:id="1"/>
+      <w:r>
+        <w:rPr>
+          <w:rStyle w:val="CommentReference"/>
+          <w:rFonts w:ascii="Times New Roman" w:hAnsi="Times New Roman" w:cs="Times New Roman"/>
+          <w:sz w:val="22"/>
+          <w:szCs w:val="22"/>
+        </w:rPr>
+        <w:commentReference w:id="1"/>
+      </w:r>
+    </w:p>
+    <w:p>
+      <w:pPr>
+        <w:rPr>
+          <w:rFonts w:ascii="Times New Roman" w:hAnsi="Times New Roman" w:cs="Times New Roman"/>
+          <w:sz w:val="22"/>
+          <w:szCs w:val="22"/>
+        </w:rPr>
+      </w:pPr>
     </w:p>
     <w:p>
       <w:pPr>
@@ -167,6 +2109,75 @@
     </w:sectPr>
   </w:body>
 </w:document>
+</file>
+
+<file path=word/comments.xml><?xml version="1.0" encoding="utf-8"?>
+<w:comments xmlns:wpc="http://schemas.microsoft.com/office/word/2010/wordprocessingCanvas" xmlns:cx="http://schemas.microsoft.com/office/drawing/2014/chartex" xmlns:cx1="http://schemas.microsoft.com/office/drawing/2015/9/8/chartex" xmlns:cx2="http://schemas.microsoft.com/office/drawing/2015/10/21/chartex" xmlns:cx3="http://schemas.microsoft.com/office/drawing/2016/5/9/chartex" xmlns:cx4="http://schemas.microsoft.com/office/drawing/2016/5/10/chartex" xmlns:cx5="http://schemas.microsoft.com/office/drawing/2016/5/11/chartex" xmlns:cx6="http://schemas.microsoft.com/office/drawing/2016/5/12/chartex" xmlns:cx7="http://schemas.microsoft.com/office/drawing/2016/5/13/chartex" xmlns:cx8="http://schemas.microsoft.com/office/drawing/2016/5/14/chartex" xmlns:mc="http://schemas.openxmlformats.org/markup-compatibility/2006" xmlns:aink="http://schemas.microsoft.com/office/drawing/2016/ink" xmlns:am3d="http://schemas.microsoft.com/office/drawing/2017/model3d" xmlns:o="urn:schemas-microsoft-com:office:office" xmlns:oel="http://schemas.microsoft.com/office/2019/extlst" xmlns:r="http://schemas.openxmlformats.org/officeDocument/2006/relationships" xmlns:m="http://schemas.openxmlformats.org/officeDocument/2006/math" xmlns:v="urn:schemas-microsoft-com:vml" xmlns:wp14="http://schemas.microsoft.com/office/word/2010/wordprocessingDrawing" xmlns:wp="http://schemas.openxmlformats.org/drawingml/2006/wordprocessingDrawing" xmlns:w10="urn:schemas-microsoft-com:office:word" xmlns:w="http://schemas.openxmlformats.org/wordprocessingml/2006/main" xmlns:w14="http://schemas.microsoft.com/office/word/2010/wordml" xmlns:w15="http://schemas.microsoft.com/office/word/2012/wordml" xmlns:w16cex="http://schemas.microsoft.com/office/word/2018/wordml/cex" xmlns:w16cid="http://schemas.microsoft.com/office/word/2016/wordml/cid" xmlns:w16="http://schemas.microsoft.com/office/word/2018/wordml" xmlns:w16du="http://schemas.microsoft.com/office/word/2023/wordml/word16du" xmlns:w16sdtdh="http://schemas.microsoft.com/office/word/2020/wordml/sdtdatahash" xmlns:w16sdtfl="http://schemas.microsoft.com/office/word/2024/wordml/sdtformatlock" xmlns:w16se="http://schemas.microsoft.com/office/word/2015/wordml/symex" xmlns:wpg="http://schemas.microsoft.com/office/word/2010/wordprocessingGroup" xmlns:wpi="http://schemas.microsoft.com/office/word/2010/wordprocessingInk" xmlns:wne="http://schemas.microsoft.com/office/word/2006/wordml" xmlns:wps="http://schemas.microsoft.com/office/word/2010/wordprocessingShape" mc:Ignorable="w14 w15 w16se w16cid w16 w16cex w16sdtdh w16sdtfl w16du wp14">
+  <w:comment w:id="0" w:author="Michael Howard" w:date="2026-02-20T21:57:00Z" w:initials="MH">
+    <w:p>
+      <w:pPr>
+        <w:pStyle w:val="CommentText"/>
+      </w:pPr>
+      <w:r>
+        <w:rPr>
+          <w:rStyle w:val="CommentReference"/>
+        </w:rPr>
+        <w:annotationRef/>
+      </w:r>
+      <w:r>
+        <w:t>Two ideas that need to be combined.</w:t>
+      </w:r>
+    </w:p>
+  </w:comment>
+  <w:comment w:id="1" w:author="Michael Howard [2]" w:date="2026-02-01T21:44:00Z" w:initials="MH">
+    <w:p>
+      <w:pPr>
+        <w:pStyle w:val="CommentText"/>
+      </w:pPr>
+      <w:r>
+        <w:rPr>
+          <w:rStyle w:val="CommentReference"/>
+        </w:rPr>
+        <w:annotationRef/>
+      </w:r>
+      <w:r>
+        <w:t>Not using just is here</w:t>
+      </w:r>
+    </w:p>
+  </w:comment>
+</w:comments>
+</file>
+
+<file path=word/commentsExtended.xml><?xml version="1.0" encoding="utf-8"?>
+<w15:commentsEx xmlns:wpc="http://schemas.microsoft.com/office/word/2010/wordprocessingCanvas" xmlns:cx="http://schemas.microsoft.com/office/drawing/2014/chartex" xmlns:cx1="http://schemas.microsoft.com/office/drawing/2015/9/8/chartex" xmlns:cx2="http://schemas.microsoft.com/office/drawing/2015/10/21/chartex" xmlns:cx3="http://schemas.microsoft.com/office/drawing/2016/5/9/chartex" xmlns:cx4="http://schemas.microsoft.com/office/drawing/2016/5/10/chartex" xmlns:cx5="http://schemas.microsoft.com/office/drawing/2016/5/11/chartex" xmlns:cx6="http://schemas.microsoft.com/office/drawing/2016/5/12/chartex" xmlns:cx7="http://schemas.microsoft.com/office/drawing/2016/5/13/chartex" xmlns:cx8="http://schemas.microsoft.com/office/drawing/2016/5/14/chartex" xmlns:mc="http://schemas.openxmlformats.org/markup-compatibility/2006" xmlns:aink="http://schemas.microsoft.com/office/drawing/2016/ink" xmlns:am3d="http://schemas.microsoft.com/office/drawing/2017/model3d" xmlns:o="urn:schemas-microsoft-com:office:office" xmlns:oel="http://schemas.microsoft.com/office/2019/extlst" xmlns:r="http://schemas.openxmlformats.org/officeDocument/2006/relationships" xmlns:m="http://schemas.openxmlformats.org/officeDocument/2006/math" xmlns:v="urn:schemas-microsoft-com:vml" xmlns:wp14="http://schemas.microsoft.com/office/word/2010/wordprocessingDrawing" xmlns:wp="http://schemas.openxmlformats.org/drawingml/2006/wordprocessingDrawing" xmlns:w10="urn:schemas-microsoft-com:office:word" xmlns:w="http://schemas.openxmlformats.org/wordprocessingml/2006/main" xmlns:w14="http://schemas.microsoft.com/office/word/2010/wordml" xmlns:w15="http://schemas.microsoft.com/office/word/2012/wordml" xmlns:w16cex="http://schemas.microsoft.com/office/word/2018/wordml/cex" xmlns:w16cid="http://schemas.microsoft.com/office/word/2016/wordml/cid" xmlns:w16="http://schemas.microsoft.com/office/word/2018/wordml" xmlns:w16du="http://schemas.microsoft.com/office/word/2023/wordml/word16du" xmlns:w16sdtdh="http://schemas.microsoft.com/office/word/2020/wordml/sdtdatahash" xmlns:w16sdtfl="http://schemas.microsoft.com/office/word/2024/wordml/sdtformatlock" xmlns:w16se="http://schemas.microsoft.com/office/word/2015/wordml/symex" xmlns:wpg="http://schemas.microsoft.com/office/word/2010/wordprocessingGroup" xmlns:wpi="http://schemas.microsoft.com/office/word/2010/wordprocessingInk" xmlns:wne="http://schemas.microsoft.com/office/word/2006/wordml" xmlns:wps="http://schemas.microsoft.com/office/word/2010/wordprocessingShape" mc:Ignorable="w14 w15 w16se w16cid w16 w16cex w16sdtdh w16sdtfl w16du wp14">
+  <w15:commentEx w15:paraId="6CF14646" w15:done="0"/>
+  <w15:commentEx w15:paraId="2FD00668" w15:done="0"/>
+</w15:commentsEx>
+</file>
+
+<file path=word/commentsExtensible.xml><?xml version="1.0" encoding="utf-8"?>
+<w16cex:commentsExtensible xmlns:wpc="http://schemas.microsoft.com/office/word/2010/wordprocessingCanvas" xmlns:cx="http://schemas.microsoft.com/office/drawing/2014/chartex" xmlns:cx1="http://schemas.microsoft.com/office/drawing/2015/9/8/chartex" xmlns:cx2="http://schemas.microsoft.com/office/drawing/2015/10/21/chartex" xmlns:cx3="http://schemas.microsoft.com/office/drawing/2016/5/9/chartex" xmlns:cx4="http://schemas.microsoft.com/office/drawing/2016/5/10/chartex" xmlns:cx5="http://schemas.microsoft.com/office/drawing/2016/5/11/chartex" xmlns:cx6="http://schemas.microsoft.com/office/drawing/2016/5/12/chartex" xmlns:cx7="http://schemas.microsoft.com/office/drawing/2016/5/13/chartex" xmlns:cx8="http://schemas.microsoft.com/office/drawing/2016/5/14/chartex" xmlns:cr="http://schemas.microsoft.com/office/comments/2020/reactions" xmlns:mc="http://schemas.openxmlformats.org/markup-compatibility/2006" xmlns:aink="http://schemas.microsoft.com/office/drawing/2016/ink" xmlns:am3d="http://schemas.microsoft.com/office/drawing/2017/model3d" xmlns:o="urn:schemas-microsoft-com:office:office" xmlns:oel="http://schemas.microsoft.com/office/2019/extlst" xmlns:r="http://schemas.openxmlformats.org/officeDocument/2006/relationships" xmlns:m="http://schemas.openxmlformats.org/officeDocument/2006/math" xmlns:v="urn:schemas-microsoft-com:vml" xmlns:wp14="http://schemas.microsoft.com/office/word/2010/wordprocessingDrawing" xmlns:wp="http://schemas.openxmlformats.org/drawingml/2006/wordprocessingDrawing" xmlns:w10="urn:schemas-microsoft-com:office:word" xmlns:w="http://schemas.openxmlformats.org/wordprocessingml/2006/main" xmlns:w14="http://schemas.microsoft.com/office/word/2010/wordml" xmlns:w15="http://schemas.microsoft.com/office/word/2012/wordml" xmlns:w16cex="http://schemas.microsoft.com/office/word/2018/wordml/cex" xmlns:w16cid="http://schemas.microsoft.com/office/word/2016/wordml/cid" xmlns:w16="http://schemas.microsoft.com/office/word/2018/wordml" xmlns:w16du="http://schemas.microsoft.com/office/word/2023/wordml/word16du" xmlns:w16sdtdh="http://schemas.microsoft.com/office/word/2020/wordml/sdtdatahash" xmlns:w16sdtfl="http://schemas.microsoft.com/office/word/2024/wordml/sdtformatlock" xmlns:w16se="http://schemas.microsoft.com/office/word/2015/wordml/symex" xmlns:wpg="http://schemas.microsoft.com/office/word/2010/wordprocessingGroup" xmlns:wpi="http://schemas.microsoft.com/office/word/2010/wordprocessingInk" xmlns:wne="http://schemas.microsoft.com/office/word/2006/wordml" xmlns:wps="http://schemas.microsoft.com/office/word/2010/wordprocessingShape" mc:Ignorable="w14 w15 w16se w16cid w16 w16cex w16sdtdh w16sdtfl cr w16du wp14">
+  <w16cex:commentExtensible w16cex:durableId="7A5D88DF" w16cex:dateUtc="2026-02-21T05:57:00Z"/>
+  <w16cex:commentExtensible w16cex:durableId="6C886959" w16cex:dateUtc="2026-02-02T05:44:00Z"/>
+</w16cex:commentsExtensible>
+</file>
+
+<file path=word/commentsIds.xml><?xml version="1.0" encoding="utf-8"?>
+<w16cid:commentsIds xmlns:wpc="http://schemas.microsoft.com/office/word/2010/wordprocessingCanvas" xmlns:cx="http://schemas.microsoft.com/office/drawing/2014/chartex" xmlns:cx1="http://schemas.microsoft.com/office/drawing/2015/9/8/chartex" xmlns:cx2="http://schemas.microsoft.com/office/drawing/2015/10/21/chartex" xmlns:cx3="http://schemas.microsoft.com/office/drawing/2016/5/9/chartex" xmlns:cx4="http://schemas.microsoft.com/office/drawing/2016/5/10/chartex" xmlns:cx5="http://schemas.microsoft.com/office/drawing/2016/5/11/chartex" xmlns:cx6="http://schemas.microsoft.com/office/drawing/2016/5/12/chartex" xmlns:cx7="http://schemas.microsoft.com/office/drawing/2016/5/13/chartex" xmlns:cx8="http://schemas.microsoft.com/office/drawing/2016/5/14/chartex" xmlns:mc="http://schemas.openxmlformats.org/markup-compatibility/2006" xmlns:aink="http://schemas.microsoft.com/office/drawing/2016/ink" xmlns:am3d="http://schemas.microsoft.com/office/drawing/2017/model3d" xmlns:o="urn:schemas-microsoft-com:office:office" xmlns:oel="http://schemas.microsoft.com/office/2019/extlst" xmlns:r="http://schemas.openxmlformats.org/officeDocument/2006/relationships" xmlns:m="http://schemas.openxmlformats.org/officeDocument/2006/math" xmlns:v="urn:schemas-microsoft-com:vml" xmlns:wp14="http://schemas.microsoft.com/office/word/2010/wordprocessingDrawing" xmlns:wp="http://schemas.openxmlformats.org/drawingml/2006/wordprocessingDrawing" xmlns:w10="urn:schemas-microsoft-com:office:word" xmlns:w="http://schemas.openxmlformats.org/wordprocessingml/2006/main" xmlns:w14="http://schemas.microsoft.com/office/word/2010/wordml" xmlns:w15="http://schemas.microsoft.com/office/word/2012/wordml" xmlns:w16cex="http://schemas.microsoft.com/office/word/2018/wordml/cex" xmlns:w16cid="http://schemas.microsoft.com/office/word/2016/wordml/cid" xmlns:w16="http://schemas.microsoft.com/office/word/2018/wordml" xmlns:w16du="http://schemas.microsoft.com/office/word/2023/wordml/word16du" xmlns:w16sdtdh="http://schemas.microsoft.com/office/word/2020/wordml/sdtdatahash" xmlns:w16sdtfl="http://schemas.microsoft.com/office/word/2024/wordml/sdtformatlock" xmlns:w16se="http://schemas.microsoft.com/office/word/2015/wordml/symex" xmlns:wpg="http://schemas.microsoft.com/office/word/2010/wordprocessingGroup" xmlns:wpi="http://schemas.microsoft.com/office/word/2010/wordprocessingInk" xmlns:wne="http://schemas.microsoft.com/office/word/2006/wordml" xmlns:wps="http://schemas.microsoft.com/office/word/2010/wordprocessingShape" mc:Ignorable="w14 w15 w16se w16cid w16 w16cex w16sdtdh w16sdtfl w16du wp14">
+  <w16cid:commentId w16cid:paraId="6CF14646" w16cid:durableId="7A5D88DF"/>
+  <w16cid:commentId w16cid:paraId="2FD00668" w16cid:durableId="6C886959"/>
+</w16cid:commentsIds>
+</file>
+
+<file path=word/people.xml><?xml version="1.0" encoding="utf-8"?>
+<w15:people xmlns:wpc="http://schemas.microsoft.com/office/word/2010/wordprocessingCanvas" xmlns:cx="http://schemas.microsoft.com/office/drawing/2014/chartex" xmlns:cx1="http://schemas.microsoft.com/office/drawing/2015/9/8/chartex" xmlns:cx2="http://schemas.microsoft.com/office/drawing/2015/10/21/chartex" xmlns:cx3="http://schemas.microsoft.com/office/drawing/2016/5/9/chartex" xmlns:cx4="http://schemas.microsoft.com/office/drawing/2016/5/10/chartex" xmlns:cx5="http://schemas.microsoft.com/office/drawing/2016/5/11/chartex" xmlns:cx6="http://schemas.microsoft.com/office/drawing/2016/5/12/chartex" xmlns:cx7="http://schemas.microsoft.com/office/drawing/2016/5/13/chartex" xmlns:cx8="http://schemas.microsoft.com/office/drawing/2016/5/14/chartex" xmlns:mc="http://schemas.openxmlformats.org/markup-compatibility/2006" xmlns:aink="http://schemas.microsoft.com/office/drawing/2016/ink" xmlns:am3d="http://schemas.microsoft.com/office/drawing/2017/model3d" xmlns:o="urn:schemas-microsoft-com:office:office" xmlns:oel="http://schemas.microsoft.com/office/2019/extlst" xmlns:r="http://schemas.openxmlformats.org/officeDocument/2006/relationships" xmlns:m="http://schemas.openxmlformats.org/officeDocument/2006/math" xmlns:v="urn:schemas-microsoft-com:vml" xmlns:wp14="http://schemas.microsoft.com/office/word/2010/wordprocessingDrawing" xmlns:wp="http://schemas.openxmlformats.org/drawingml/2006/wordprocessingDrawing" xmlns:w10="urn:schemas-microsoft-com:office:word" xmlns:w="http://schemas.openxmlformats.org/wordprocessingml/2006/main" xmlns:w14="http://schemas.microsoft.com/office/word/2010/wordml" xmlns:w15="http://schemas.microsoft.com/office/word/2012/wordml" xmlns:w16cex="http://schemas.microsoft.com/office/word/2018/wordml/cex" xmlns:w16cid="http://schemas.microsoft.com/office/word/2016/wordml/cid" xmlns:w16="http://schemas.microsoft.com/office/word/2018/wordml" xmlns:w16du="http://schemas.microsoft.com/office/word/2023/wordml/word16du" xmlns:w16sdtdh="http://schemas.microsoft.com/office/word/2020/wordml/sdtdatahash" xmlns:w16sdtfl="http://schemas.microsoft.com/office/word/2024/wordml/sdtformatlock" xmlns:w16se="http://schemas.microsoft.com/office/word/2015/wordml/symex" xmlns:wpg="http://schemas.microsoft.com/office/word/2010/wordprocessingGroup" xmlns:wpi="http://schemas.microsoft.com/office/word/2010/wordprocessingInk" xmlns:wne="http://schemas.microsoft.com/office/word/2006/wordml" xmlns:wps="http://schemas.microsoft.com/office/word/2010/wordprocessingShape" mc:Ignorable="w14 w15 w16se w16cid w16 w16cex w16sdtdh w16sdtfl w16du wp14">
+  <w15:person w15:author="Michael Howard">
+    <w15:presenceInfo w15:providerId="Windows Live" w15:userId="ea82ac4c8c064b5a"/>
+  </w15:person>
+  <w15:person w15:author="Michael Howard [2]">
+    <w15:presenceInfo w15:providerId="AD" w15:userId="S::michael.howard@digipen.edu::4b49d193-c9eb-4a65-bfed-cfe0fa24cbad"/>
+  </w15:person>
+</w15:people>
 </file>
 
 <file path=word/styles.xml><?xml version="1.0" encoding="utf-8"?>
@@ -772,7 +2783,6 @@
   <w:style w:type="character" w:default="1" w:styleId="DefaultParagraphFont">
     <w:name w:val="Default Paragraph Font"/>
     <w:uiPriority w:val="1"/>
-    <w:semiHidden/>
     <w:unhideWhenUsed/>
   </w:style>
   <w:style w:type="table" w:default="1" w:styleId="TableNormal">
@@ -1084,6 +3094,72 @@
       <w:smallCaps/>
       <w:color w:val="0F4761" w:themeColor="accent1" w:themeShade="BF"/>
       <w:spacing w:val="5"/>
+    </w:rPr>
+  </w:style>
+  <w:style w:type="character" w:styleId="CommentReference">
+    <w:name w:val="annotation reference"/>
+    <w:basedOn w:val="DefaultParagraphFont"/>
+    <w:uiPriority w:val="99"/>
+    <w:semiHidden/>
+    <w:unhideWhenUsed/>
+    <w:rsid w:val="00AF6643"/>
+    <w:rPr>
+      <w:sz w:val="16"/>
+      <w:szCs w:val="16"/>
+    </w:rPr>
+  </w:style>
+  <w:style w:type="paragraph" w:styleId="CommentText">
+    <w:name w:val="annotation text"/>
+    <w:basedOn w:val="Normal"/>
+    <w:link w:val="CommentTextChar"/>
+    <w:uiPriority w:val="99"/>
+    <w:unhideWhenUsed/>
+    <w:rsid w:val="00AF6643"/>
+    <w:pPr>
+      <w:spacing w:line="240" w:lineRule="auto"/>
+    </w:pPr>
+    <w:rPr>
+      <w:sz w:val="20"/>
+      <w:szCs w:val="20"/>
+    </w:rPr>
+  </w:style>
+  <w:style w:type="character" w:customStyle="1" w:styleId="CommentTextChar">
+    <w:name w:val="Comment Text Char"/>
+    <w:basedOn w:val="DefaultParagraphFont"/>
+    <w:link w:val="CommentText"/>
+    <w:uiPriority w:val="99"/>
+    <w:rsid w:val="00AF6643"/>
+    <w:rPr>
+      <w:sz w:val="20"/>
+      <w:szCs w:val="20"/>
+    </w:rPr>
+  </w:style>
+  <w:style w:type="paragraph" w:styleId="CommentSubject">
+    <w:name w:val="annotation subject"/>
+    <w:basedOn w:val="CommentText"/>
+    <w:next w:val="CommentText"/>
+    <w:link w:val="CommentSubjectChar"/>
+    <w:uiPriority w:val="99"/>
+    <w:semiHidden/>
+    <w:unhideWhenUsed/>
+    <w:rsid w:val="00AF6643"/>
+    <w:rPr>
+      <w:b/>
+      <w:bCs/>
+    </w:rPr>
+  </w:style>
+  <w:style w:type="character" w:customStyle="1" w:styleId="CommentSubjectChar">
+    <w:name w:val="Comment Subject Char"/>
+    <w:basedOn w:val="CommentTextChar"/>
+    <w:link w:val="CommentSubject"/>
+    <w:uiPriority w:val="99"/>
+    <w:semiHidden/>
+    <w:rsid w:val="00AF6643"/>
+    <w:rPr>
+      <w:b/>
+      <w:bCs/>
+      <w:sz w:val="20"/>
+      <w:szCs w:val="20"/>
     </w:rPr>
   </w:style>
 </w:styles>

</xml_diff>